<commit_message>
docs: catalog sync for waves 59+60 (CLAUDE-3) — add balancemonitor/scan/llmfailover/llmadapter/deltacrdt/gputopo/fsresidency to README + FOUNDATION_PACKAGES + CHANGELOG (19 units this session); regenerate md->html/pdf/docx exports; docs_chain verify in-sync.
Co-Authored-By: Claude Opus 4.8 <noreply@anthropic.com>
</commit_message>
<xml_diff>
--- a/docs/export/CHANGELOG.docx
+++ b/docs/export/CHANGELOG.docx
@@ -745,7 +745,7 @@
         </w:numPr>
       </w:pPr>
       <w:r>
-        <w:t xml:space="preserve">This session (12 pure-Go units):</w:t>
+        <w:t xml:space="preserve">This session (19 pure-Go units):</w:t>
       </w:r>
     </w:p>
     <w:p>
@@ -1169,6 +1169,183 @@
       </w:r>
       <w:r>
         <w:t xml:space="preserve">— config-epoch failover slot-ownership conflict resolution (highest-epoch wins, deterministic lexicographic equal-epoch tiebreak, order-independent convergence) (HXC-1397).</w:t>
+      </w:r>
+    </w:p>
+    <w:p>
+      <w:pPr>
+        <w:pStyle w:val="Compact"/>
+        <w:numPr>
+          <w:ilvl w:val="2"/>
+          <w:numId w:val="1003"/>
+        </w:numPr>
+      </w:pPr>
+      <w:r>
+        <w:rPr>
+          <w:rStyle w:val="VerbatimChar"/>
+        </w:rPr>
+        <w:t xml:space="preserve">balancemonitor</w:t>
+      </w:r>
+      <w:r>
+        <w:t xml:space="preserve"> </w:t>
+      </w:r>
+      <w:r>
+        <w:t xml:space="preserve">— USD account-balance monitor with a strict low-balance floor warning, over HTTP with</w:t>
+      </w:r>
+      <w:r>
+        <w:t xml:space="preserve"> </w:t>
+      </w:r>
+      <w:r>
+        <w:rPr>
+          <w:rStyle w:val="VerbatimChar"/>
+        </w:rPr>
+        <w:t xml:space="preserve">Authorization: Bearer</w:t>
+      </w:r>
+      <w:r>
+        <w:t xml:space="preserve"> </w:t>
+      </w:r>
+      <w:r>
+        <w:t xml:space="preserve">(HXC-1512).</w:t>
+      </w:r>
+    </w:p>
+    <w:p>
+      <w:pPr>
+        <w:pStyle w:val="Compact"/>
+        <w:numPr>
+          <w:ilvl w:val="2"/>
+          <w:numId w:val="1003"/>
+        </w:numPr>
+      </w:pPr>
+      <w:r>
+        <w:rPr>
+          <w:rStyle w:val="VerbatimChar"/>
+        </w:rPr>
+        <w:t xml:space="preserve">scan</w:t>
+      </w:r>
+      <w:r>
+        <w:t xml:space="preserve"> </w:t>
+      </w:r>
+      <w:r>
+        <w:t xml:space="preserve">— Oracle-SCAN-style stable virtual client endpoint: least-loaded healthy-backend routing with a membership-stable name and injected clock (HXC-1403).</w:t>
+      </w:r>
+    </w:p>
+    <w:p>
+      <w:pPr>
+        <w:pStyle w:val="Compact"/>
+        <w:numPr>
+          <w:ilvl w:val="2"/>
+          <w:numId w:val="1003"/>
+        </w:numPr>
+      </w:pPr>
+      <w:r>
+        <w:rPr>
+          <w:rStyle w:val="VerbatimChar"/>
+        </w:rPr>
+        <w:t xml:space="preserve">llmfailover</w:t>
+      </w:r>
+      <w:r>
+        <w:t xml:space="preserve"> </w:t>
+      </w:r>
+      <w:r>
+        <w:t xml:space="preserve">— error-classified LLM failover taxonomy (deterministic per-class fallback paths) plus a sandbox scheduling-hint contract (HXC-1600).</w:t>
+      </w:r>
+    </w:p>
+    <w:p>
+      <w:pPr>
+        <w:pStyle w:val="Compact"/>
+        <w:numPr>
+          <w:ilvl w:val="2"/>
+          <w:numId w:val="1003"/>
+        </w:numPr>
+      </w:pPr>
+      <w:r>
+        <w:rPr>
+          <w:rStyle w:val="VerbatimChar"/>
+        </w:rPr>
+        <w:t xml:space="preserve">llmadapter</w:t>
+      </w:r>
+      <w:r>
+        <w:t xml:space="preserve"> </w:t>
+      </w:r>
+      <w:r>
+        <w:t xml:space="preserve">— Claude Messages / OpenAI Responses-API request and response shape adapters to OpenAI chat-completions, preserving tool-call order (HXC-1599).</w:t>
+      </w:r>
+    </w:p>
+    <w:p>
+      <w:pPr>
+        <w:pStyle w:val="Compact"/>
+        <w:numPr>
+          <w:ilvl w:val="2"/>
+          <w:numId w:val="1003"/>
+        </w:numPr>
+      </w:pPr>
+      <w:r>
+        <w:rPr>
+          <w:rStyle w:val="VerbatimChar"/>
+        </w:rPr>
+        <w:t xml:space="preserve">deltacrdt</w:t>
+      </w:r>
+      <w:r>
+        <w:t xml:space="preserve"> </w:t>
+      </w:r>
+      <w:r>
+        <w:t xml:space="preserve">— standalone delta-state CRDTs (G-counter / PN-counter / observed-remove OR-set / LWW-map) with delta-mutators and a convergent (commutative/associative/idempotent) merge (HXC-1409).</w:t>
+      </w:r>
+    </w:p>
+    <w:p>
+      <w:pPr>
+        <w:pStyle w:val="Compact"/>
+        <w:numPr>
+          <w:ilvl w:val="2"/>
+          <w:numId w:val="1003"/>
+        </w:numPr>
+      </w:pPr>
+      <w:r>
+        <w:rPr>
+          <w:rStyle w:val="VerbatimChar"/>
+        </w:rPr>
+        <w:t xml:space="preserve">gputopo</w:t>
+      </w:r>
+      <w:r>
+        <w:t xml:space="preserve"> </w:t>
+      </w:r>
+      <w:r>
+        <w:t xml:space="preserve">— topology-aware NUMA/NVLink GPU placement scoring that prefers NVLink-connected GPU pairs and falls back to PCIe (HXC-1406).</w:t>
+      </w:r>
+    </w:p>
+    <w:p>
+      <w:pPr>
+        <w:pStyle w:val="Compact"/>
+        <w:numPr>
+          <w:ilvl w:val="2"/>
+          <w:numId w:val="1003"/>
+        </w:numPr>
+      </w:pPr>
+      <w:r>
+        <w:rPr>
+          <w:rStyle w:val="VerbatimChar"/>
+        </w:rPr>
+        <w:t xml:space="preserve">fsresidency</w:t>
+      </w:r>
+      <w:r>
+        <w:t xml:space="preserve"> </w:t>
+      </w:r>
+      <w:r>
+        <w:t xml:space="preserve">— filesystem residency challenge: per-byte-range</w:t>
+      </w:r>
+      <w:r>
+        <w:t xml:space="preserve"> </w:t>
+      </w:r>
+      <w:r>
+        <w:rPr>
+          <w:rStyle w:val="VerbatimChar"/>
+        </w:rPr>
+        <w:t xml:space="preserve">ReadAt</w:t>
+      </w:r>
+      <w:r>
+        <w:t xml:space="preserve"> </w:t>
+      </w:r>
+      <w:r>
+        <w:t xml:space="preserve">+ SHA-256 verification proving a model file is really present on disk; truncated/missing/mismatch all fail (HXC-1572).</w:t>
       </w:r>
     </w:p>
     <w:p>

</xml_diff>

<commit_message>
docs: catalog sync for wave 61 (CLAUDE-3) — add economics/revenueopt/exportcontrol/devicecatalog to README + FOUNDATION_PACKAGES + CHANGELOG (23 units this session); regenerate md->html/pdf/docx exports; docs_chain verify in-sync.
Co-Authored-By: Claude Opus 4.8 <noreply@anthropic.com>
</commit_message>
<xml_diff>
--- a/docs/export/CHANGELOG.docx
+++ b/docs/export/CHANGELOG.docx
@@ -745,7 +745,7 @@
         </w:numPr>
       </w:pPr>
       <w:r>
-        <w:t xml:space="preserve">This session (19 pure-Go units):</w:t>
+        <w:t xml:space="preserve">This session (23 pure-Go units):</w:t>
       </w:r>
     </w:p>
     <w:p>
@@ -1346,6 +1346,198 @@
       </w:r>
       <w:r>
         <w:t xml:space="preserve">+ SHA-256 verification proving a model file is really present on disk; truncated/missing/mismatch all fail (HXC-1572).</w:t>
+      </w:r>
+    </w:p>
+    <w:p>
+      <w:pPr>
+        <w:pStyle w:val="Compact"/>
+        <w:numPr>
+          <w:ilvl w:val="2"/>
+          <w:numId w:val="1003"/>
+        </w:numPr>
+      </w:pPr>
+      <w:r>
+        <w:rPr>
+          <w:rStyle w:val="VerbatimChar"/>
+        </w:rPr>
+        <w:t xml:space="preserve">economics</w:t>
+      </w:r>
+      <w:r>
+        <w:t xml:space="preserve"> </w:t>
+      </w:r>
+      <w:r>
+        <w:t xml:space="preserve">—</w:t>
+      </w:r>
+      <w:r>
+        <w:t xml:space="preserve"> </w:t>
+      </w:r>
+      <w:r>
+        <w:rPr>
+          <w:rStyle w:val="VerbatimChar"/>
+        </w:rPr>
+        <w:t xml:space="preserve">RewardDistributor</w:t>
+      </w:r>
+      <w:r>
+        <w:t xml:space="preserve"> </w:t>
+      </w:r>
+      <w:r>
+        <w:t xml:space="preserve">multi-token distribution with treasury/reinvest splits and a conservation invariant (</w:t>
+      </w:r>
+      <w:r>
+        <w:rPr>
+          <w:rStyle w:val="VerbatimChar"/>
+        </w:rPr>
+        <w:t xml:space="preserve">sum(ledger)+treasury+reinvest == total</w:t>
+      </w:r>
+      <w:r>
+        <w:t xml:space="preserve">), plus</w:t>
+      </w:r>
+      <w:r>
+        <w:t xml:space="preserve"> </w:t>
+      </w:r>
+      <w:r>
+        <w:rPr>
+          <w:rStyle w:val="VerbatimChar"/>
+        </w:rPr>
+        <w:t xml:space="preserve">GetParticipantROI</w:t>
+      </w:r>
+      <w:r>
+        <w:t xml:space="preserve"> </w:t>
+      </w:r>
+      <w:r>
+        <w:t xml:space="preserve">(ROI% + break-even days, typed unknown-participant error) (HXC-1460, HXC-1461).</w:t>
+      </w:r>
+    </w:p>
+    <w:p>
+      <w:pPr>
+        <w:pStyle w:val="Compact"/>
+        <w:numPr>
+          <w:ilvl w:val="2"/>
+          <w:numId w:val="1003"/>
+        </w:numPr>
+      </w:pPr>
+      <w:r>
+        <w:rPr>
+          <w:rStyle w:val="VerbatimChar"/>
+        </w:rPr>
+        <w:t xml:space="preserve">revenueopt</w:t>
+      </w:r>
+      <w:r>
+        <w:t xml:space="preserve"> </w:t>
+      </w:r>
+      <w:r>
+        <w:t xml:space="preserve">—</w:t>
+      </w:r>
+      <w:r>
+        <w:t xml:space="preserve"> </w:t>
+      </w:r>
+      <w:r>
+        <w:rPr>
+          <w:rStyle w:val="VerbatimChar"/>
+        </w:rPr>
+        <w:t xml:space="preserve">RevenueOptimizer.OptimizeAllocation</w:t>
+      </w:r>
+      <w:r>
+        <w:t xml:space="preserve"> </w:t>
+      </w:r>
+      <w:r>
+        <w:t xml:space="preserve">greedy GPU→marketplace assignment maximising expected revenue, with a TEE→Chutes revenue bias; self-contained types (HXC-1456).</w:t>
+      </w:r>
+    </w:p>
+    <w:p>
+      <w:pPr>
+        <w:pStyle w:val="Compact"/>
+        <w:numPr>
+          <w:ilvl w:val="2"/>
+          <w:numId w:val="1003"/>
+        </w:numPr>
+      </w:pPr>
+      <w:r>
+        <w:rPr>
+          <w:rStyle w:val="VerbatimChar"/>
+        </w:rPr>
+        <w:t xml:space="preserve">exportcontrol</w:t>
+      </w:r>
+      <w:r>
+        <w:t xml:space="preserve"> </w:t>
+      </w:r>
+      <w:r>
+        <w:t xml:space="preserve">— export-control / country-code KYC gate: a controlled GPU (</w:t>
+      </w:r>
+      <w:r>
+        <w:rPr>
+          <w:rStyle w:val="VerbatimChar"/>
+        </w:rPr>
+        <w:t xml:space="preserve">H100</w:t>
+      </w:r>
+      <w:r>
+        <w:t xml:space="preserve">/</w:t>
+      </w:r>
+      <w:r>
+        <w:rPr>
+          <w:rStyle w:val="VerbatimChar"/>
+        </w:rPr>
+        <w:t xml:space="preserve">A100</w:t>
+      </w:r>
+      <w:r>
+        <w:t xml:space="preserve">) from a Tier-3 (embargoed) or unknown jurisdiction is rejected with</w:t>
+      </w:r>
+      <w:r>
+        <w:t xml:space="preserve"> </w:t>
+      </w:r>
+      <w:r>
+        <w:rPr>
+          <w:rStyle w:val="VerbatimChar"/>
+        </w:rPr>
+        <w:t xml:space="preserve">ErrExportDenied</w:t>
+      </w:r>
+      <w:r>
+        <w:t xml:space="preserve">; Tier-1 is allowed (HXC-1482).</w:t>
+      </w:r>
+    </w:p>
+    <w:p>
+      <w:pPr>
+        <w:pStyle w:val="Compact"/>
+        <w:numPr>
+          <w:ilvl w:val="2"/>
+          <w:numId w:val="1003"/>
+        </w:numPr>
+      </w:pPr>
+      <w:r>
+        <w:rPr>
+          <w:rStyle w:val="VerbatimChar"/>
+        </w:rPr>
+        <w:t xml:space="preserve">devicecatalog</w:t>
+      </w:r>
+      <w:r>
+        <w:t xml:space="preserve"> </w:t>
+      </w:r>
+      <w:r>
+        <w:t xml:space="preserve">— machine-readable 64-device taxonomy with case-insensitive substring</w:t>
+      </w:r>
+      <w:r>
+        <w:t xml:space="preserve"> </w:t>
+      </w:r>
+      <w:r>
+        <w:rPr>
+          <w:rStyle w:val="VerbatimChar"/>
+        </w:rPr>
+        <w:t xml:space="preserve">Lookup</w:t>
+      </w:r>
+      <w:r>
+        <w:t xml:space="preserve"> </w:t>
+      </w:r>
+      <w:r>
+        <w:t xml:space="preserve">resolving a discovered CPU model (e.g. </w:t>
+      </w:r>
+      <w:r>
+        <w:rPr>
+          <w:rStyle w:val="VerbatimChar"/>
+        </w:rPr>
+        <w:t xml:space="preserve">Rockchip RK3588</w:t>
+      </w:r>
+      <w:r>
+        <w:t xml:space="preserve">) to its tier / trust-level / compute-class (HXC-1331).</w:t>
       </w:r>
     </w:p>
     <w:p>

</xml_diff>

<commit_message>
docs: catalog sync for wave 62 (CLAUDE-3) — add compliancedoc/hybridkex/carbonsched + gpuattest multi-GPU enumeration to README + FOUNDATION_PACKAGES + CHANGELOG (27 units this session); regenerate md->html/pdf/docx exports; docs_chain verify in-sync.
Co-Authored-By: Claude Opus 4.8 <noreply@anthropic.com>
</commit_message>
<xml_diff>
--- a/docs/export/CHANGELOG.docx
+++ b/docs/export/CHANGELOG.docx
@@ -745,7 +745,7 @@
         </w:numPr>
       </w:pPr>
       <w:r>
-        <w:t xml:space="preserve">This session (23 pure-Go units):</w:t>
+        <w:t xml:space="preserve">This session (27 pure-Go units):</w:t>
       </w:r>
     </w:p>
     <w:p>
@@ -1538,6 +1538,132 @@
       </w:r>
       <w:r>
         <w:t xml:space="preserve">) to its tier / trust-level / compute-class (HXC-1331).</w:t>
+      </w:r>
+    </w:p>
+    <w:p>
+      <w:pPr>
+        <w:pStyle w:val="Compact"/>
+        <w:numPr>
+          <w:ilvl w:val="2"/>
+          <w:numId w:val="1003"/>
+        </w:numPr>
+      </w:pPr>
+      <w:r>
+        <w:rPr>
+          <w:rStyle w:val="VerbatimChar"/>
+        </w:rPr>
+        <w:t xml:space="preserve">compliancedoc</w:t>
+      </w:r>
+      <w:r>
+        <w:t xml:space="preserve"> </w:t>
+      </w:r>
+      <w:r>
+        <w:t xml:space="preserve">— EU AI Act compliance-documentation pipeline: generates a model card + technical-documentation artifact from attestation-log records, with a SHA-256 provenance hash bound to the actual record content (HXC-1481).</w:t>
+      </w:r>
+    </w:p>
+    <w:p>
+      <w:pPr>
+        <w:pStyle w:val="Compact"/>
+        <w:numPr>
+          <w:ilvl w:val="2"/>
+          <w:numId w:val="1003"/>
+        </w:numPr>
+      </w:pPr>
+      <w:r>
+        <w:rPr>
+          <w:rStyle w:val="VerbatimChar"/>
+        </w:rPr>
+        <w:t xml:space="preserve">hybridkex</w:t>
+      </w:r>
+      <w:r>
+        <w:t xml:space="preserve"> </w:t>
+      </w:r>
+      <w:r>
+        <w:t xml:space="preserve">— hybrid post-quantum key exchange combining X25519 (</w:t>
+      </w:r>
+      <w:r>
+        <w:rPr>
+          <w:rStyle w:val="VerbatimChar"/>
+        </w:rPr>
+        <w:t xml:space="preserve">crypto/ecdh</w:t>
+      </w:r>
+      <w:r>
+        <w:t xml:space="preserve">) and ML-KEM-768 (</w:t>
+      </w:r>
+      <w:r>
+        <w:rPr>
+          <w:rStyle w:val="VerbatimChar"/>
+        </w:rPr>
+        <w:t xml:space="preserve">crypto/mlkem</w:t>
+      </w:r>
+      <w:r>
+        <w:t xml:space="preserve">) shared secrets via HKDF-SHA256 (group</w:t>
+      </w:r>
+      <w:r>
+        <w:t xml:space="preserve"> </w:t>
+      </w:r>
+      <w:r>
+        <w:rPr>
+          <w:rStyle w:val="VerbatimChar"/>
+        </w:rPr>
+        <w:t xml:space="preserve">X25519MLKEM768</w:t>
+      </w:r>
+      <w:r>
+        <w:t xml:space="preserve">); a tampered ML-KEM ciphertext yields a non-matching key (HXC-1476).</w:t>
+      </w:r>
+    </w:p>
+    <w:p>
+      <w:pPr>
+        <w:pStyle w:val="Compact"/>
+        <w:numPr>
+          <w:ilvl w:val="2"/>
+          <w:numId w:val="1003"/>
+        </w:numPr>
+      </w:pPr>
+      <w:r>
+        <w:rPr>
+          <w:rStyle w:val="VerbatimChar"/>
+        </w:rPr>
+        <w:t xml:space="preserve">carbonsched</w:t>
+      </w:r>
+      <w:r>
+        <w:t xml:space="preserve"> </w:t>
+      </w:r>
+      <w:r>
+        <w:t xml:space="preserve">— carbon-aware job placement: chooses the lowest-carbon-intensity latency-eligible region (deterministic name tiebreak) with per-job kWh / gCO2 metering (HXC-1480).</w:t>
+      </w:r>
+    </w:p>
+    <w:p>
+      <w:pPr>
+        <w:pStyle w:val="Compact"/>
+        <w:numPr>
+          <w:ilvl w:val="2"/>
+          <w:numId w:val="1003"/>
+        </w:numPr>
+      </w:pPr>
+      <w:r>
+        <w:rPr>
+          <w:rStyle w:val="VerbatimChar"/>
+        </w:rPr>
+        <w:t xml:space="preserve">gpuattest</w:t>
+      </w:r>
+      <w:r>
+        <w:t xml:space="preserve"> </w:t>
+      </w:r>
+      <w:r>
+        <w:t xml:space="preserve">(additive</w:t>
+      </w:r>
+      <w:r>
+        <w:t xml:space="preserve"> </w:t>
+      </w:r>
+      <w:r>
+        <w:rPr>
+          <w:rStyle w:val="VerbatimChar"/>
+        </w:rPr>
+        <w:t xml:space="preserve">multigpu.go</w:t>
+      </w:r>
+      <w:r>
+        <w:t xml:space="preserve">) — multi-GPU node enumeration: an N-GPU node descriptor yields N distinct, independently-verifiable per-device attestation proofs keyed by GPU UUID; rejects duplicate/empty descriptors (HXC-1573).</w:t>
       </w:r>
     </w:p>
     <w:p>

</xml_diff>

<commit_message>
docs: catalog sync for wave 63 (CLAUDE-3) — add workloadrouter + metrics tier/cost/provider-health series to README + FOUNDATION_PACKAGES + CHANGELOG (29 units this session); regenerate md->html/pdf/docx exports; docs_chain verify in-sync.
Co-Authored-By: Claude Opus 4.8 <noreply@anthropic.com>
</commit_message>
<xml_diff>
--- a/docs/export/CHANGELOG.docx
+++ b/docs/export/CHANGELOG.docx
@@ -745,7 +745,7 @@
         </w:numPr>
       </w:pPr>
       <w:r>
-        <w:t xml:space="preserve">This session (27 pure-Go units):</w:t>
+        <w:t xml:space="preserve">This session (29 pure-Go units):</w:t>
       </w:r>
     </w:p>
     <w:p>
@@ -1664,6 +1664,126 @@
       </w:r>
       <w:r>
         <w:t xml:space="preserve">) — multi-GPU node enumeration: an N-GPU node descriptor yields N distinct, independently-verifiable per-device attestation proofs keyed by GPU UUID; rejects duplicate/empty descriptors (HXC-1573).</w:t>
+      </w:r>
+    </w:p>
+    <w:p>
+      <w:pPr>
+        <w:pStyle w:val="Compact"/>
+        <w:numPr>
+          <w:ilvl w:val="2"/>
+          <w:numId w:val="1003"/>
+        </w:numPr>
+      </w:pPr>
+      <w:r>
+        <w:rPr>
+          <w:rStyle w:val="VerbatimChar"/>
+        </w:rPr>
+        <w:t xml:space="preserve">workloadrouter</w:t>
+      </w:r>
+      <w:r>
+        <w:t xml:space="preserve"> </w:t>
+      </w:r>
+      <w:r>
+        <w:t xml:space="preserve">—</w:t>
+      </w:r>
+      <w:r>
+        <w:t xml:space="preserve"> </w:t>
+      </w:r>
+      <w:r>
+        <w:rPr>
+          <w:rStyle w:val="VerbatimChar"/>
+        </w:rPr>
+        <w:t xml:space="preserve">UnifiedManager.RouteWorkload</w:t>
+      </w:r>
+      <w:r>
+        <w:t xml:space="preserve">: concurrent per-marketplace price probes + a weighted composite score (inverse price/latency, health) with a TEE multiplier that re-ranks confidential offers when the workload requires a TEE (HXC-1455).</w:t>
+      </w:r>
+    </w:p>
+    <w:p>
+      <w:pPr>
+        <w:pStyle w:val="Compact"/>
+        <w:numPr>
+          <w:ilvl w:val="2"/>
+          <w:numId w:val="1003"/>
+        </w:numPr>
+      </w:pPr>
+      <w:r>
+        <w:rPr>
+          <w:rStyle w:val="VerbatimChar"/>
+        </w:rPr>
+        <w:t xml:space="preserve">metrics</w:t>
+      </w:r>
+      <w:r>
+        <w:t xml:space="preserve"> </w:t>
+      </w:r>
+      <w:r>
+        <w:t xml:space="preserve">(additive</w:t>
+      </w:r>
+      <w:r>
+        <w:t xml:space="preserve"> </w:t>
+      </w:r>
+      <w:r>
+        <w:rPr>
+          <w:rStyle w:val="VerbatimChar"/>
+        </w:rPr>
+        <w:t xml:space="preserve">tiermetrics.go</w:t>
+      </w:r>
+      <w:r>
+        <w:t xml:space="preserve">) —</w:t>
+      </w:r>
+      <w:r>
+        <w:t xml:space="preserve"> </w:t>
+      </w:r>
+      <w:r>
+        <w:rPr>
+          <w:rStyle w:val="VerbatimChar"/>
+        </w:rPr>
+        <w:t xml:space="preserve">TierMetrics</w:t>
+      </w:r>
+      <w:r>
+        <w:t xml:space="preserve"> </w:t>
+      </w:r>
+      <w:r>
+        <w:t xml:space="preserve">exposes</w:t>
+      </w:r>
+      <w:r>
+        <w:t xml:space="preserve"> </w:t>
+      </w:r>
+      <w:r>
+        <w:rPr>
+          <w:rStyle w:val="VerbatimChar"/>
+        </w:rPr>
+        <w:t xml:space="preserve">gpu_tier_utilization</w:t>
+      </w:r>
+      <w:r>
+        <w:t xml:space="preserve">,</w:t>
+      </w:r>
+      <w:r>
+        <w:t xml:space="preserve"> </w:t>
+      </w:r>
+      <w:r>
+        <w:rPr>
+          <w:rStyle w:val="VerbatimChar"/>
+        </w:rPr>
+        <w:t xml:space="preserve">gpu_cost_per_hour</w:t>
+      </w:r>
+      <w:r>
+        <w:t xml:space="preserve">, and</w:t>
+      </w:r>
+      <w:r>
+        <w:t xml:space="preserve"> </w:t>
+      </w:r>
+      <w:r>
+        <w:rPr>
+          <w:rStyle w:val="VerbatimChar"/>
+        </w:rPr>
+        <w:t xml:space="preserve">provider_health</w:t>
+      </w:r>
+      <w:r>
+        <w:t xml:space="preserve"> </w:t>
+      </w:r>
+      <w:r>
+        <w:t xml:space="preserve">Prometheus-text series with deterministic ordering and concurrent-safe setters (HXC-1535).</w:t>
       </w:r>
     </w:p>
     <w:p>

</xml_diff>

<commit_message>
docs: catalog sync for wave 64 (CLAUDE-3) — add cmd/gpu-pool-manager + marketplaceadapter to README + FOUNDATION_PACKAGES + CHANGELOG (31 units this session); regenerate md->html/pdf/docx exports; docs_chain verify in-sync.
Co-Authored-By: Claude Opus 4.8 <noreply@anthropic.com>
</commit_message>
<xml_diff>
--- a/docs/export/CHANGELOG.docx
+++ b/docs/export/CHANGELOG.docx
@@ -745,7 +745,7 @@
         </w:numPr>
       </w:pPr>
       <w:r>
-        <w:t xml:space="preserve">This session (29 pure-Go units):</w:t>
+        <w:t xml:space="preserve">This session (31 pure-Go units):</w:t>
       </w:r>
     </w:p>
     <w:p>
@@ -1784,6 +1784,174 @@
       </w:r>
       <w:r>
         <w:t xml:space="preserve">Prometheus-text series with deterministic ordering and concurrent-safe setters (HXC-1535).</w:t>
+      </w:r>
+    </w:p>
+    <w:p>
+      <w:pPr>
+        <w:pStyle w:val="Compact"/>
+        <w:numPr>
+          <w:ilvl w:val="2"/>
+          <w:numId w:val="1003"/>
+        </w:numPr>
+      </w:pPr>
+      <w:r>
+        <w:rPr>
+          <w:rStyle w:val="VerbatimChar"/>
+        </w:rPr>
+        <w:t xml:space="preserve">cmd/gpu-pool-manager</w:t>
+      </w:r>
+      <w:r>
+        <w:t xml:space="preserve"> </w:t>
+      </w:r>
+      <w:r>
+        <w:t xml:space="preserve">— GPU pool manager HTTP front-end:</w:t>
+      </w:r>
+      <w:r>
+        <w:t xml:space="preserve"> </w:t>
+      </w:r>
+      <w:r>
+        <w:rPr>
+          <w:rStyle w:val="VerbatimChar"/>
+        </w:rPr>
+        <w:t xml:space="preserve">POST /allocate</w:t>
+      </w:r>
+      <w:r>
+        <w:t xml:space="preserve"> </w:t>
+      </w:r>
+      <w:r>
+        <w:t xml:space="preserve">returns the tier-correct (lowest-tier healthy, name tiebreak) provider as JSON (</w:t>
+      </w:r>
+      <w:r>
+        <w:rPr>
+          <w:rStyle w:val="VerbatimChar"/>
+        </w:rPr>
+        <w:t xml:space="preserve">503</w:t>
+      </w:r>
+      <w:r>
+        <w:t xml:space="preserve"> </w:t>
+      </w:r>
+      <w:r>
+        <w:t xml:space="preserve">when none healthy) and</w:t>
+      </w:r>
+      <w:r>
+        <w:t xml:space="preserve"> </w:t>
+      </w:r>
+      <w:r>
+        <w:rPr>
+          <w:rStyle w:val="VerbatimChar"/>
+        </w:rPr>
+        <w:t xml:space="preserve">GET /providers</w:t>
+      </w:r>
+      <w:r>
+        <w:t xml:space="preserve"> </w:t>
+      </w:r>
+      <w:r>
+        <w:t xml:space="preserve">lists providers with health; httptest-gated, self-contained (HXC-1530).</w:t>
+      </w:r>
+    </w:p>
+    <w:p>
+      <w:pPr>
+        <w:pStyle w:val="Compact"/>
+        <w:numPr>
+          <w:ilvl w:val="2"/>
+          <w:numId w:val="1003"/>
+        </w:numPr>
+      </w:pPr>
+      <w:r>
+        <w:rPr>
+          <w:rStyle w:val="VerbatimChar"/>
+        </w:rPr>
+        <w:t xml:space="preserve">marketplaceadapter</w:t>
+      </w:r>
+      <w:r>
+        <w:t xml:space="preserve"> </w:t>
+      </w:r>
+      <w:r>
+        <w:t xml:space="preserve">—</w:t>
+      </w:r>
+      <w:r>
+        <w:t xml:space="preserve"> </w:t>
+      </w:r>
+      <w:r>
+        <w:rPr>
+          <w:rStyle w:val="VerbatimChar"/>
+        </w:rPr>
+        <w:t xml:space="preserve">MarketplaceAdapter</w:t>
+      </w:r>
+      <w:r>
+        <w:t xml:space="preserve"> </w:t>
+      </w:r>
+      <w:r>
+        <w:t xml:space="preserve">interface (</w:t>
+      </w:r>
+      <w:r>
+        <w:rPr>
+          <w:rStyle w:val="VerbatimChar"/>
+        </w:rPr>
+        <w:t xml:space="preserve">Name</w:t>
+      </w:r>
+      <w:r>
+        <w:t xml:space="preserve">/</w:t>
+      </w:r>
+      <w:r>
+        <w:rPr>
+          <w:rStyle w:val="VerbatimChar"/>
+        </w:rPr>
+        <w:t xml:space="preserve">GetCurrentPricing</w:t>
+      </w:r>
+      <w:r>
+        <w:t xml:space="preserve">/</w:t>
+      </w:r>
+      <w:r>
+        <w:rPr>
+          <w:rStyle w:val="VerbatimChar"/>
+        </w:rPr>
+        <w:t xml:space="preserve">SubmitWork</w:t>
+      </w:r>
+      <w:r>
+        <w:t xml:space="preserve">) with a</w:t>
+      </w:r>
+      <w:r>
+        <w:t xml:space="preserve"> </w:t>
+      </w:r>
+      <w:r>
+        <w:rPr>
+          <w:rStyle w:val="VerbatimChar"/>
+        </w:rPr>
+        <w:t xml:space="preserve">Name()</w:t>
+      </w:r>
+      <w:r>
+        <w:t xml:space="preserve">-keyed dispatch</w:t>
+      </w:r>
+      <w:r>
+        <w:t xml:space="preserve"> </w:t>
+      </w:r>
+      <w:r>
+        <w:rPr>
+          <w:rStyle w:val="VerbatimChar"/>
+        </w:rPr>
+        <w:t xml:space="preserve">Registry</w:t>
+      </w:r>
+      <w:r>
+        <w:t xml:space="preserve"> </w:t>
+      </w:r>
+      <w:r>
+        <w:t xml:space="preserve">and a</w:t>
+      </w:r>
+      <w:r>
+        <w:t xml:space="preserve"> </w:t>
+      </w:r>
+      <w:r>
+        <w:rPr>
+          <w:rStyle w:val="VerbatimChar"/>
+        </w:rPr>
+        <w:t xml:space="preserve">ChutesAdapter</w:t>
+      </w:r>
+      <w:r>
+        <w:t xml:space="preserve"> </w:t>
+      </w:r>
+      <w:r>
+        <w:t xml:space="preserve">over HTTP (httptest fixture, non-2xx rejected) (HXC-1454).</w:t>
       </w:r>
     </w:p>
     <w:p>

</xml_diff>

<commit_message>
docs: catalog sync for wave 65 (CLAUDE-3) — add cmd/e2ee-proxy + e2eebench to README + FOUNDATION_PACKAGES + CHANGELOG (33 units this session); regenerate md->html/pdf/docx exports; docs_chain verify in-sync.
Co-Authored-By: Claude Opus 4.8 <noreply@anthropic.com>
</commit_message>
<xml_diff>
--- a/docs/export/CHANGELOG.docx
+++ b/docs/export/CHANGELOG.docx
@@ -745,7 +745,7 @@
         </w:numPr>
       </w:pPr>
       <w:r>
-        <w:t xml:space="preserve">This session (31 pure-Go units):</w:t>
+        <w:t xml:space="preserve">This session (33 pure-Go units):</w:t>
       </w:r>
     </w:p>
     <w:p>
@@ -1952,6 +1952,126 @@
       </w:r>
       <w:r>
         <w:t xml:space="preserve">over HTTP (httptest fixture, non-2xx rejected) (HXC-1454).</w:t>
+      </w:r>
+    </w:p>
+    <w:p>
+      <w:pPr>
+        <w:pStyle w:val="Compact"/>
+        <w:numPr>
+          <w:ilvl w:val="2"/>
+          <w:numId w:val="1003"/>
+        </w:numPr>
+      </w:pPr>
+      <w:r>
+        <w:rPr>
+          <w:rStyle w:val="VerbatimChar"/>
+        </w:rPr>
+        <w:t xml:space="preserve">cmd/e2ee-proxy</w:t>
+      </w:r>
+      <w:r>
+        <w:t xml:space="preserve"> </w:t>
+      </w:r>
+      <w:r>
+        <w:t xml:space="preserve">— transparent ML-KEM-768 (</w:t>
+      </w:r>
+      <w:r>
+        <w:rPr>
+          <w:rStyle w:val="VerbatimChar"/>
+        </w:rPr>
+        <w:t xml:space="preserve">crypto/mlkem</w:t>
+      </w:r>
+      <w:r>
+        <w:t xml:space="preserve">) + AES-256-GCM encrypting proxy:</w:t>
+      </w:r>
+      <w:r>
+        <w:t xml:space="preserve"> </w:t>
+      </w:r>
+      <w:r>
+        <w:rPr>
+          <w:rStyle w:val="VerbatimChar"/>
+        </w:rPr>
+        <w:t xml:space="preserve">EncryptingTransport</w:t>
+      </w:r>
+      <w:r>
+        <w:t xml:space="preserve"> </w:t>
+      </w:r>
+      <w:r>
+        <w:t xml:space="preserve">seals request bodies and</w:t>
+      </w:r>
+      <w:r>
+        <w:t xml:space="preserve"> </w:t>
+      </w:r>
+      <w:r>
+        <w:rPr>
+          <w:rStyle w:val="VerbatimChar"/>
+        </w:rPr>
+        <w:t xml:space="preserve">DecryptingHandler</w:t>
+      </w:r>
+      <w:r>
+        <w:t xml:space="preserve"> </w:t>
+      </w:r>
+      <w:r>
+        <w:t xml:space="preserve">opens them, so the on-wire payload between proxy and upstream is ciphertext-only while the client receives the correct plaintext; tampered ciphertext is rejected (HXC-1532).</w:t>
+      </w:r>
+    </w:p>
+    <w:p>
+      <w:pPr>
+        <w:pStyle w:val="Compact"/>
+        <w:numPr>
+          <w:ilvl w:val="2"/>
+          <w:numId w:val="1003"/>
+        </w:numPr>
+      </w:pPr>
+      <w:r>
+        <w:rPr>
+          <w:rStyle w:val="VerbatimChar"/>
+        </w:rPr>
+        <w:t xml:space="preserve">e2eebench</w:t>
+      </w:r>
+      <w:r>
+        <w:t xml:space="preserve"> </w:t>
+      </w:r>
+      <w:r>
+        <w:t xml:space="preserve">—</w:t>
+      </w:r>
+      <w:r>
+        <w:t xml:space="preserve"> </w:t>
+      </w:r>
+      <w:r>
+        <w:rPr>
+          <w:rStyle w:val="VerbatimChar"/>
+        </w:rPr>
+        <w:t xml:space="preserve">MeasureHandshakeLatency</w:t>
+      </w:r>
+      <w:r>
+        <w:t xml:space="preserve"> </w:t>
+      </w:r>
+      <w:r>
+        <w:t xml:space="preserve">benchmarks the</w:t>
+      </w:r>
+      <w:r>
+        <w:t xml:space="preserve"> </w:t>
+      </w:r>
+      <w:r>
+        <w:rPr>
+          <w:rStyle w:val="VerbatimChar"/>
+        </w:rPr>
+        <w:t xml:space="preserve">hybridkex</w:t>
+      </w:r>
+      <w:r>
+        <w:t xml:space="preserve"> </w:t>
+      </w:r>
+      <w:r>
+        <w:t xml:space="preserve">full handshake (median + P95), proving median &lt; 1ms on host and enforcing per-iteration key agreement (</w:t>
+      </w:r>
+      <w:r>
+        <w:rPr>
+          <w:rStyle w:val="VerbatimChar"/>
+        </w:rPr>
+        <w:t xml:space="preserve">ErrKeyDisagreement</w:t>
+      </w:r>
+      <w:r>
+        <w:t xml:space="preserve">) (HXC-1556).</w:t>
       </w:r>
     </w:p>
     <w:p>

</xml_diff>

<commit_message>
Foundation wave 66 (HXC-1424): hardened architecture diagram + component map (docs/ARCHITECTURE.md) mechanically enforced by pkg/archlint
archlint parses the L0-L7 Component Map table (49 components) and FAILS the build if any documented component maps to a package path absent on disk. Gated: whole-tree build+vet + -race + mutation bite (neuter VerifyPackages -> TestArchLint_DetectsMissingPackage FAILS). docs/ARCHITECTURE.md registered in .docs_chain/contexts/tracked_docs.yaml (md->html/pdf/docx); docs_chain verify in-sync. README documentation index + CHANGELOG updated (34 units this session). Pure stdlib.

Co-Authored-By: Claude Opus 4.8 <noreply@anthropic.com>
</commit_message>
<xml_diff>
--- a/docs/export/CHANGELOG.docx
+++ b/docs/export/CHANGELOG.docx
@@ -745,7 +745,7 @@
         </w:numPr>
       </w:pPr>
       <w:r>
-        <w:t xml:space="preserve">This session (33 pure-Go units):</w:t>
+        <w:t xml:space="preserve">This session (34 pure-Go units):</w:t>
       </w:r>
     </w:p>
     <w:p>
@@ -2072,6 +2072,57 @@
       </w:r>
       <w:r>
         <w:t xml:space="preserve">) (HXC-1556).</w:t>
+      </w:r>
+    </w:p>
+    <w:p>
+      <w:pPr>
+        <w:pStyle w:val="Compact"/>
+        <w:numPr>
+          <w:ilvl w:val="2"/>
+          <w:numId w:val="1003"/>
+        </w:numPr>
+      </w:pPr>
+      <w:r>
+        <w:rPr>
+          <w:rStyle w:val="VerbatimChar"/>
+        </w:rPr>
+        <w:t xml:space="preserve">archlint</w:t>
+      </w:r>
+      <w:r>
+        <w:t xml:space="preserve"> </w:t>
+      </w:r>
+      <w:r>
+        <w:t xml:space="preserve">+</w:t>
+      </w:r>
+      <w:r>
+        <w:t xml:space="preserve"> </w:t>
+      </w:r>
+      <w:r>
+        <w:rPr>
+          <w:rStyle w:val="VerbatimChar"/>
+        </w:rPr>
+        <w:t xml:space="preserve">docs/ARCHITECTURE.md</w:t>
+      </w:r>
+      <w:r>
+        <w:t xml:space="preserve"> </w:t>
+      </w:r>
+      <w:r>
+        <w:t xml:space="preserve">— the hardened L0–L7 architecture diagram and component map, mechanically enforced:</w:t>
+      </w:r>
+      <w:r>
+        <w:t xml:space="preserve"> </w:t>
+      </w:r>
+      <w:r>
+        <w:rPr>
+          <w:rStyle w:val="VerbatimChar"/>
+        </w:rPr>
+        <w:t xml:space="preserve">archlint</w:t>
+      </w:r>
+      <w:r>
+        <w:t xml:space="preserve"> </w:t>
+      </w:r>
+      <w:r>
+        <w:t xml:space="preserve">parses the component-map table and fails the build if any documented component maps to a package path that does not exist on disk (HXC-1424).</w:t>
       </w:r>
     </w:p>
     <w:p>

</xml_diff>

<commit_message>
docs: CLAUDE-3 catalog sync for wave 67 — add multiraft/stonith/deviceplugin/chutes-config/gpu-reservation to README + FOUNDATION_PACKAGES + CHANGELOG; regenerate md->html/pdf/docx exports; docs_chain verify in-sync.
Co-Authored-By: Claude Opus 4.8 <noreply@anthropic.com>
</commit_message>
<xml_diff>
--- a/docs/export/CHANGELOG.docx
+++ b/docs/export/CHANGELOG.docx
@@ -2129,6 +2129,351 @@
       <w:pPr>
         <w:pStyle w:val="Compact"/>
         <w:numPr>
+          <w:ilvl w:val="1"/>
+          <w:numId w:val="1002"/>
+        </w:numPr>
+      </w:pPr>
+      <w:r>
+        <w:t xml:space="preserve">Wave 67 (5 units, subagent-driven, 5 parallel streams in disjoint packages):</w:t>
+      </w:r>
+    </w:p>
+    <w:p>
+      <w:pPr>
+        <w:pStyle w:val="Compact"/>
+        <w:numPr>
+          <w:ilvl w:val="2"/>
+          <w:numId w:val="1004"/>
+        </w:numPr>
+      </w:pPr>
+      <w:r>
+        <w:rPr>
+          <w:rStyle w:val="VerbatimChar"/>
+        </w:rPr>
+        <w:t xml:space="preserve">multiraft</w:t>
+      </w:r>
+      <w:r>
+        <w:t xml:space="preserve"> </w:t>
+      </w:r>
+      <w:r>
+        <w:t xml:space="preserve">—</w:t>
+      </w:r>
+      <w:r>
+        <w:t xml:space="preserve"> </w:t>
+      </w:r>
+      <w:r>
+        <w:rPr>
+          <w:rStyle w:val="VerbatimChar"/>
+        </w:rPr>
+        <w:t xml:space="preserve">MultiRaftManager</w:t>
+      </w:r>
+      <w:r>
+        <w:t xml:space="preserve"> </w:t>
+      </w:r>
+      <w:r>
+        <w:t xml:space="preserve">partitioning cluster state into independent per-shard</w:t>
+      </w:r>
+      <w:r>
+        <w:t xml:space="preserve"> </w:t>
+      </w:r>
+      <w:r>
+        <w:rPr>
+          <w:rStyle w:val="VerbatimChar"/>
+        </w:rPr>
+        <w:t xml:space="preserve">go.etcd.io/raft/v3</w:t>
+      </w:r>
+      <w:r>
+        <w:t xml:space="preserve"> </w:t>
+      </w:r>
+      <w:r>
+        <w:t xml:space="preserve">groups, each electing its own leader and committing independently via per-shard</w:t>
+      </w:r>
+      <w:r>
+        <w:t xml:space="preserve"> </w:t>
+      </w:r>
+      <w:r>
+        <w:rPr>
+          <w:rStyle w:val="VerbatimChar"/>
+        </w:rPr>
+        <w:t xml:space="preserve">Propose</w:t>
+      </w:r>
+      <w:r>
+        <w:t xml:space="preserve"> </w:t>
+      </w:r>
+      <w:r>
+        <w:t xml:space="preserve">routing over an in-process</w:t>
+      </w:r>
+      <w:r>
+        <w:t xml:space="preserve"> </w:t>
+      </w:r>
+      <w:r>
+        <w:rPr>
+          <w:rStyle w:val="VerbatimChar"/>
+        </w:rPr>
+        <w:t xml:space="preserve">RaftTransport</w:t>
+      </w:r>
+      <w:r>
+        <w:t xml:space="preserve">; write throughput scales with shard count and a shard re-elects on leader loss while others keep committing (HXC-1387).</w:t>
+      </w:r>
+    </w:p>
+    <w:p>
+      <w:pPr>
+        <w:pStyle w:val="Compact"/>
+        <w:numPr>
+          <w:ilvl w:val="2"/>
+          <w:numId w:val="1004"/>
+        </w:numPr>
+      </w:pPr>
+      <w:r>
+        <w:rPr>
+          <w:rStyle w:val="VerbatimChar"/>
+        </w:rPr>
+        <w:t xml:space="preserve">stonith</w:t>
+      </w:r>
+      <w:r>
+        <w:t xml:space="preserve"> </w:t>
+      </w:r>
+      <w:r>
+        <w:t xml:space="preserve">— STONITH fencing: a</w:t>
+      </w:r>
+      <w:r>
+        <w:t xml:space="preserve"> </w:t>
+      </w:r>
+      <w:r>
+        <w:rPr>
+          <w:rStyle w:val="VerbatimChar"/>
+        </w:rPr>
+        <w:t xml:space="preserve">FencingAgent</w:t>
+      </w:r>
+      <w:r>
+        <w:t xml:space="preserve"> </w:t>
+      </w:r>
+      <w:r>
+        <w:t xml:space="preserve">interface with IPMI / AWS-EC2 / Azure-ARM / SBD-shared-disk / NoOp drivers and a</w:t>
+      </w:r>
+      <w:r>
+        <w:t xml:space="preserve"> </w:t>
+      </w:r>
+      <w:r>
+        <w:rPr>
+          <w:rStyle w:val="VerbatimChar"/>
+        </w:rPr>
+        <w:t xml:space="preserve">MultiLevelFencer</w:t>
+      </w:r>
+      <w:r>
+        <w:t xml:space="preserve"> </w:t>
+      </w:r>
+      <w:r>
+        <w:t xml:space="preserve">multi-level fallback, with sink-side fence confirmation; the IPMI real-binary path is an honest SKIP-with-reason when</w:t>
+      </w:r>
+      <w:r>
+        <w:t xml:space="preserve"> </w:t>
+      </w:r>
+      <w:r>
+        <w:rPr>
+          <w:rStyle w:val="VerbatimChar"/>
+        </w:rPr>
+        <w:t xml:space="preserve">ipmitool</w:t>
+      </w:r>
+      <w:r>
+        <w:t xml:space="preserve"> </w:t>
+      </w:r>
+      <w:r>
+        <w:t xml:space="preserve">is absent (HXC-1401).</w:t>
+      </w:r>
+    </w:p>
+    <w:p>
+      <w:pPr>
+        <w:pStyle w:val="Compact"/>
+        <w:numPr>
+          <w:ilvl w:val="2"/>
+          <w:numId w:val="1004"/>
+        </w:numPr>
+      </w:pPr>
+      <w:r>
+        <w:rPr>
+          <w:rStyle w:val="VerbatimChar"/>
+        </w:rPr>
+        <w:t xml:space="preserve">deviceplugin</w:t>
+      </w:r>
+      <w:r>
+        <w:t xml:space="preserve"> </w:t>
+      </w:r>
+      <w:r>
+        <w:t xml:space="preserve">— Nomad/K8s-style gRPC device-plugin / GRES fingerprinting framework over real gRPC: plugins register full device fingerprints, the registry parses GRES descriptors, atomically applies fingerprints, allocates by request, and rejects oversubscription (HXC-1407).</w:t>
+      </w:r>
+    </w:p>
+    <w:p>
+      <w:pPr>
+        <w:pStyle w:val="Compact"/>
+        <w:numPr>
+          <w:ilvl w:val="2"/>
+          <w:numId w:val="1004"/>
+        </w:numPr>
+      </w:pPr>
+      <w:r>
+        <w:rPr>
+          <w:rStyle w:val="VerbatimChar"/>
+        </w:rPr>
+        <w:t xml:space="preserve">internal/gpu</w:t>
+      </w:r>
+      <w:r>
+        <w:t xml:space="preserve"> </w:t>
+      </w:r>
+      <w:r>
+        <w:t xml:space="preserve">(additive</w:t>
+      </w:r>
+      <w:r>
+        <w:t xml:space="preserve"> </w:t>
+      </w:r>
+      <w:r>
+        <w:rPr>
+          <w:rStyle w:val="VerbatimChar"/>
+        </w:rPr>
+        <w:t xml:space="preserve">manager_helixpow.go</w:t>
+      </w:r>
+      <w:r>
+        <w:t xml:space="preserve">) — dual-workload capacity reservation:</w:t>
+      </w:r>
+      <w:r>
+        <w:t xml:space="preserve"> </w:t>
+      </w:r>
+      <w:r>
+        <w:rPr>
+          <w:rStyle w:val="VerbatimChar"/>
+        </w:rPr>
+        <w:t xml:space="preserve">ReserveForHelixPoW(fraction)</w:t>
+      </w:r>
+      <w:r>
+        <w:t xml:space="preserve"> </w:t>
+      </w:r>
+      <w:r>
+        <w:t xml:space="preserve">+</w:t>
+      </w:r>
+      <w:r>
+        <w:t xml:space="preserve"> </w:t>
+      </w:r>
+      <w:r>
+        <w:rPr>
+          <w:rStyle w:val="VerbatimChar"/>
+        </w:rPr>
+        <w:t xml:space="preserve">ChutesCapacity()</w:t>
+      </w:r>
+      <w:r>
+        <w:t xml:space="preserve"> </w:t>
+      </w:r>
+      <w:r>
+        <w:t xml:space="preserve">reporting only the non-reserved remainder, with a strict</w:t>
+      </w:r>
+      <w:r>
+        <w:t xml:space="preserve"> </w:t>
+      </w:r>
+      <w:r>
+        <w:rPr>
+          <w:rStyle w:val="VerbatimChar"/>
+        </w:rPr>
+        <w:t xml:space="preserve">&gt;0.80</w:t>
+      </w:r>
+      <w:r>
+        <w:t xml:space="preserve"> </w:t>
+      </w:r>
+      <w:r>
+        <w:t xml:space="preserve">Helix-load Gepetto starvation guard that zeroes Chutes capacity (HXC-1447).</w:t>
+      </w:r>
+    </w:p>
+    <w:p>
+      <w:pPr>
+        <w:pStyle w:val="Compact"/>
+        <w:numPr>
+          <w:ilvl w:val="2"/>
+          <w:numId w:val="1004"/>
+        </w:numPr>
+      </w:pPr>
+      <w:r>
+        <w:rPr>
+          <w:rStyle w:val="VerbatimChar"/>
+        </w:rPr>
+        <w:t xml:space="preserve">chutes</w:t>
+      </w:r>
+      <w:r>
+        <w:t xml:space="preserve"> </w:t>
+      </w:r>
+      <w:r>
+        <w:t xml:space="preserve">(additive</w:t>
+      </w:r>
+      <w:r>
+        <w:t xml:space="preserve"> </w:t>
+      </w:r>
+      <w:r>
+        <w:rPr>
+          <w:rStyle w:val="VerbatimChar"/>
+        </w:rPr>
+        <w:t xml:space="preserve">config.go</w:t>
+      </w:r>
+      <w:r>
+        <w:t xml:space="preserve">) —</w:t>
+      </w:r>
+      <w:r>
+        <w:t xml:space="preserve"> </w:t>
+      </w:r>
+      <w:r>
+        <w:rPr>
+          <w:rStyle w:val="VerbatimChar"/>
+        </w:rPr>
+        <w:t xml:space="preserve">ChutesMinerConfig</w:t>
+      </w:r>
+      <w:r>
+        <w:t xml:space="preserve"> </w:t>
+      </w:r>
+      <w:r>
+        <w:t xml:space="preserve">and</w:t>
+      </w:r>
+      <w:r>
+        <w:t xml:space="preserve"> </w:t>
+      </w:r>
+      <w:r>
+        <w:rPr>
+          <w:rStyle w:val="VerbatimChar"/>
+        </w:rPr>
+        <w:t xml:space="preserve">ValidatorConfig</w:t>
+      </w:r>
+      <w:r>
+        <w:t xml:space="preserve"> </w:t>
+      </w:r>
+      <w:r>
+        <w:t xml:space="preserve">deployment descriptors with</w:t>
+      </w:r>
+      <w:r>
+        <w:t xml:space="preserve"> </w:t>
+      </w:r>
+      <w:r>
+        <w:rPr>
+          <w:rStyle w:val="VerbatimChar"/>
+        </w:rPr>
+        <w:t xml:space="preserve">Validate()</w:t>
+      </w:r>
+      <w:r>
+        <w:t xml:space="preserve"> </w:t>
+      </w:r>
+      <w:r>
+        <w:t xml:space="preserve">invariants (non-empty IDs/hotkeys,</w:t>
+      </w:r>
+      <w:r>
+        <w:t xml:space="preserve"> </w:t>
+      </w:r>
+      <w:r>
+        <w:rPr>
+          <w:rStyle w:val="VerbatimChar"/>
+        </w:rPr>
+        <w:t xml:space="preserve">GPUCount&gt;0</w:t>
+      </w:r>
+      <w:r>
+        <w:t xml:space="preserve">, non-negative cost, positive cache size, TEE consistency) (HXC-1439).</w:t>
+      </w:r>
+    </w:p>
+    <w:p>
+      <w:pPr>
+        <w:pStyle w:val="Compact"/>
+        <w:numPr>
           <w:ilvl w:val="0"/>
           <w:numId w:val="1001"/>
         </w:numPr>
@@ -2372,7 +2717,7 @@
         <w:pStyle w:val="Compact"/>
         <w:numPr>
           <w:ilvl w:val="0"/>
-          <w:numId w:val="1004"/>
+          <w:numId w:val="1005"/>
         </w:numPr>
       </w:pPr>
       <w:r>
@@ -2429,7 +2774,7 @@
         <w:pStyle w:val="Compact"/>
         <w:numPr>
           <w:ilvl w:val="0"/>
-          <w:numId w:val="1005"/>
+          <w:numId w:val="1006"/>
         </w:numPr>
       </w:pPr>
       <w:r>
@@ -2668,6 +3013,9 @@
     <w:abstractNumId w:val="991"/>
   </w:num>
   <w:num w:numId="1005">
+    <w:abstractNumId w:val="991"/>
+  </w:num>
+  <w:num w:numId="1006">
     <w:abstractNumId w:val="991"/>
   </w:num>
 </w:numbering>

</xml_diff>

<commit_message>
docs: CLAUDE-3 catalog sync for wave 68 — add dst/porcupine/kraft/chaos + multiraft LeaseTracker to README + FOUNDATION_PACKAGES + CHANGELOG; regenerate md->html/pdf/docx exports; docs_chain verify in-sync.
Co-Authored-By: Claude Opus 4.8 <noreply@anthropic.com>
</commit_message>
<xml_diff>
--- a/docs/export/CHANGELOG.docx
+++ b/docs/export/CHANGELOG.docx
@@ -2474,6 +2474,195 @@
       <w:pPr>
         <w:pStyle w:val="Compact"/>
         <w:numPr>
+          <w:ilvl w:val="1"/>
+          <w:numId w:val="1002"/>
+        </w:numPr>
+      </w:pPr>
+      <w:r>
+        <w:t xml:space="preserve">Wave 68 (5 units, subagent-driven, 5 parallel streams in disjoint packages, run concurrently with wave 69):</w:t>
+      </w:r>
+    </w:p>
+    <w:p>
+      <w:pPr>
+        <w:pStyle w:val="Compact"/>
+        <w:numPr>
+          <w:ilvl w:val="2"/>
+          <w:numId w:val="1005"/>
+        </w:numPr>
+      </w:pPr>
+      <w:r>
+        <w:rPr>
+          <w:rStyle w:val="VerbatimChar"/>
+        </w:rPr>
+        <w:t xml:space="preserve">dst</w:t>
+      </w:r>
+      <w:r>
+        <w:t xml:space="preserve"> </w:t>
+      </w:r>
+      <w:r>
+        <w:t xml:space="preserve">— standalone FoundationDB-style deterministic simulation harness: single-threaded seeded-RNG event loop with injectable network/disk/logical-clock; same seed =&gt; byte-for-byte identical trace + exact failure replay; 1000+ seeded sims (HXC-1419).</w:t>
+      </w:r>
+    </w:p>
+    <w:p>
+      <w:pPr>
+        <w:pStyle w:val="Compact"/>
+        <w:numPr>
+          <w:ilvl w:val="2"/>
+          <w:numId w:val="1005"/>
+        </w:numPr>
+      </w:pPr>
+      <w:r>
+        <w:rPr>
+          <w:rStyle w:val="VerbatimChar"/>
+        </w:rPr>
+        <w:t xml:space="preserve">porcupine</w:t>
+      </w:r>
+      <w:r>
+        <w:t xml:space="preserve"> </w:t>
+      </w:r>
+      <w:r>
+        <w:t xml:space="preserve">— self-contained WGL linearizability checker + concurrent history recorder: PASS on linearizable, FAIL (with violating op) on a seeded non-linearizable history (HXC-1421).</w:t>
+      </w:r>
+    </w:p>
+    <w:p>
+      <w:pPr>
+        <w:pStyle w:val="Compact"/>
+        <w:numPr>
+          <w:ilvl w:val="2"/>
+          <w:numId w:val="1005"/>
+        </w:numPr>
+      </w:pPr>
+      <w:r>
+        <w:rPr>
+          <w:rStyle w:val="VerbatimChar"/>
+        </w:rPr>
+        <w:t xml:space="preserve">kraft</w:t>
+      </w:r>
+      <w:r>
+        <w:t xml:space="preserve"> </w:t>
+      </w:r>
+      <w:r>
+        <w:t xml:space="preserve">— KRaft-style self-managed Raft metadata quorum (</w:t>
+      </w:r>
+      <w:r>
+        <w:rPr>
+          <w:rStyle w:val="VerbatimChar"/>
+        </w:rPr>
+        <w:t xml:space="preserve">go.etcd.io/raft/v3</w:t>
+      </w:r>
+      <w:r>
+        <w:t xml:space="preserve">, no ZooKeeper): replicated</w:t>
+      </w:r>
+      <w:r>
+        <w:t xml:space="preserve"> </w:t>
+      </w:r>
+      <w:r>
+        <w:rPr>
+          <w:rStyle w:val="VerbatimChar"/>
+        </w:rPr>
+        <w:t xml:space="preserve">CreateTopic</w:t>
+      </w:r>
+      <w:r>
+        <w:t xml:space="preserve">/</w:t>
+      </w:r>
+      <w:r>
+        <w:rPr>
+          <w:rStyle w:val="VerbatimChar"/>
+        </w:rPr>
+        <w:t xml:space="preserve">ListTopics</w:t>
+      </w:r>
+      <w:r>
+        <w:t xml:space="preserve"> </w:t>
+      </w:r>
+      <w:r>
+        <w:t xml:space="preserve">+ partition-leader assignment, controller election + controller-loss failover (HXC-1417).</w:t>
+      </w:r>
+    </w:p>
+    <w:p>
+      <w:pPr>
+        <w:pStyle w:val="Compact"/>
+        <w:numPr>
+          <w:ilvl w:val="2"/>
+          <w:numId w:val="1005"/>
+        </w:numPr>
+      </w:pPr>
+      <w:r>
+        <w:rPr>
+          <w:rStyle w:val="VerbatimChar"/>
+        </w:rPr>
+        <w:t xml:space="preserve">internal/chaos</w:t>
+      </w:r>
+      <w:r>
+        <w:t xml:space="preserve"> </w:t>
+      </w:r>
+      <w:r>
+        <w:t xml:space="preserve">— fault-injection library (PodKill/NetworkPartition/DiskStall/ClockSkew) + canary-guarded runner with automatic rollback on health&lt;SLO; deterministic via injected clock + seeded selection (HXC-1422).</w:t>
+      </w:r>
+    </w:p>
+    <w:p>
+      <w:pPr>
+        <w:pStyle w:val="Compact"/>
+        <w:numPr>
+          <w:ilvl w:val="2"/>
+          <w:numId w:val="1005"/>
+        </w:numPr>
+      </w:pPr>
+      <w:r>
+        <w:rPr>
+          <w:rStyle w:val="VerbatimChar"/>
+        </w:rPr>
+        <w:t xml:space="preserve">multiraft</w:t>
+      </w:r>
+      <w:r>
+        <w:t xml:space="preserve"> </w:t>
+      </w:r>
+      <w:r>
+        <w:t xml:space="preserve">(additive</w:t>
+      </w:r>
+      <w:r>
+        <w:t xml:space="preserve"> </w:t>
+      </w:r>
+      <w:r>
+        <w:rPr>
+          <w:rStyle w:val="VerbatimChar"/>
+        </w:rPr>
+        <w:t xml:space="preserve">lease.go</w:t>
+      </w:r>
+      <w:r>
+        <w:t xml:space="preserve">) —</w:t>
+      </w:r>
+      <w:r>
+        <w:t xml:space="preserve"> </w:t>
+      </w:r>
+      <w:r>
+        <w:rPr>
+          <w:rStyle w:val="VerbatimChar"/>
+        </w:rPr>
+        <w:t xml:space="preserve">LeaseTracker</w:t>
+      </w:r>
+      <w:r>
+        <w:t xml:space="preserve"> </w:t>
+      </w:r>
+      <w:r>
+        <w:t xml:space="preserve">CockroachDB-style leaseholder local reads (no Raft round-trip), follower routing via</w:t>
+      </w:r>
+      <w:r>
+        <w:t xml:space="preserve"> </w:t>
+      </w:r>
+      <w:r>
+        <w:rPr>
+          <w:rStyle w:val="VerbatimChar"/>
+        </w:rPr>
+        <w:t xml:space="preserve">RaftTransport.SendRead</w:t>
+      </w:r>
+      <w:r>
+        <w:t xml:space="preserve">, lease-expiry re-route against an injected clock (HXC-1389).</w:t>
+      </w:r>
+    </w:p>
+    <w:p>
+      <w:pPr>
+        <w:pStyle w:val="Compact"/>
+        <w:numPr>
           <w:ilvl w:val="0"/>
           <w:numId w:val="1001"/>
         </w:numPr>
@@ -2717,7 +2906,7 @@
         <w:pStyle w:val="Compact"/>
         <w:numPr>
           <w:ilvl w:val="0"/>
-          <w:numId w:val="1005"/>
+          <w:numId w:val="1006"/>
         </w:numPr>
       </w:pPr>
       <w:r>
@@ -2774,7 +2963,7 @@
         <w:pStyle w:val="Compact"/>
         <w:numPr>
           <w:ilvl w:val="0"/>
-          <w:numId w:val="1006"/>
+          <w:numId w:val="1007"/>
         </w:numPr>
       </w:pPr>
       <w:r>
@@ -3016,6 +3205,9 @@
     <w:abstractNumId w:val="991"/>
   </w:num>
   <w:num w:numId="1006">
+    <w:abstractNumId w:val="991"/>
+  </w:num>
+  <w:num w:numId="1007">
     <w:abstractNumId w:val="991"/>
   </w:num>
 </w:numbering>

</xml_diff>

<commit_message>
docs: CLAUDE-3 catalog sync for wave 69 — IPMI cred hardening, deviceplugin race test, internal/llm real router, metrics EarningsMetrics, internal/gpu attestation hook; regenerate exports; docs_chain verify in-sync.
Co-Authored-By: Claude Opus 4.8 <noreply@anthropic.com>
</commit_message>
<xml_diff>
--- a/docs/export/CHANGELOG.docx
+++ b/docs/export/CHANGELOG.docx
@@ -2663,6 +2663,366 @@
       <w:pPr>
         <w:pStyle w:val="Compact"/>
         <w:numPr>
+          <w:ilvl w:val="1"/>
+          <w:numId w:val="1002"/>
+        </w:numPr>
+      </w:pPr>
+      <w:r>
+        <w:t xml:space="preserve">Wave 69 (5 units, subagent-driven, 5 parallel streams in disjoint packages, run concurrently with wave 68):</w:t>
+      </w:r>
+    </w:p>
+    <w:p>
+      <w:pPr>
+        <w:pStyle w:val="Compact"/>
+        <w:numPr>
+          <w:ilvl w:val="2"/>
+          <w:numId w:val="1006"/>
+        </w:numPr>
+      </w:pPr>
+      <w:r>
+        <w:rPr>
+          <w:rStyle w:val="VerbatimChar"/>
+        </w:rPr>
+        <w:t xml:space="preserve">stonith</w:t>
+      </w:r>
+      <w:r>
+        <w:t xml:space="preserve"> </w:t>
+      </w:r>
+      <w:r>
+        <w:t xml:space="preserve">— IPMI credential hardening: BMC password delivered via the</w:t>
+      </w:r>
+      <w:r>
+        <w:t xml:space="preserve"> </w:t>
+      </w:r>
+      <w:r>
+        <w:rPr>
+          <w:rStyle w:val="VerbatimChar"/>
+        </w:rPr>
+        <w:t xml:space="preserve">IPMI_PASSWORD</w:t>
+      </w:r>
+      <w:r>
+        <w:t xml:space="preserve"> </w:t>
+      </w:r>
+      <w:r>
+        <w:t xml:space="preserve">env +</w:t>
+      </w:r>
+      <w:r>
+        <w:t xml:space="preserve"> </w:t>
+      </w:r>
+      <w:r>
+        <w:rPr>
+          <w:rStyle w:val="VerbatimChar"/>
+        </w:rPr>
+        <w:t xml:space="preserve">-E</w:t>
+      </w:r>
+      <w:r>
+        <w:t xml:space="preserve"> </w:t>
+      </w:r>
+      <w:r>
+        <w:t xml:space="preserve">(never on the argv / process table) with redacted argv in error strings; tests assert the password appears in neither argv nor errors (HXC-908, closing a wave-67 follow-up).</w:t>
+      </w:r>
+    </w:p>
+    <w:p>
+      <w:pPr>
+        <w:pStyle w:val="Compact"/>
+        <w:numPr>
+          <w:ilvl w:val="2"/>
+          <w:numId w:val="1006"/>
+        </w:numPr>
+      </w:pPr>
+      <w:r>
+        <w:rPr>
+          <w:rStyle w:val="VerbatimChar"/>
+        </w:rPr>
+        <w:t xml:space="preserve">deviceplugin</w:t>
+      </w:r>
+      <w:r>
+        <w:t xml:space="preserve"> </w:t>
+      </w:r>
+      <w:r>
+        <w:t xml:space="preserve">— concurrency test driving</w:t>
+      </w:r>
+      <w:r>
+        <w:t xml:space="preserve"> </w:t>
+      </w:r>
+      <w:r>
+        <w:rPr>
+          <w:rStyle w:val="VerbatimChar"/>
+        </w:rPr>
+        <w:t xml:space="preserve">ApplyFingerprint</w:t>
+      </w:r>
+      <w:r>
+        <w:t xml:space="preserve">/</w:t>
+      </w:r>
+      <w:r>
+        <w:rPr>
+          <w:rStyle w:val="VerbatimChar"/>
+        </w:rPr>
+        <w:t xml:space="preserve">Allocate</w:t>
+      </w:r>
+      <w:r>
+        <w:t xml:space="preserve">/</w:t>
+      </w:r>
+      <w:r>
+        <w:rPr>
+          <w:rStyle w:val="VerbatimChar"/>
+        </w:rPr>
+        <w:t xml:space="preserve">Release</w:t>
+      </w:r>
+      <w:r>
+        <w:t xml:space="preserve"> </w:t>
+      </w:r>
+      <w:r>
+        <w:t xml:space="preserve">from 50+ goroutines under</w:t>
+      </w:r>
+      <w:r>
+        <w:t xml:space="preserve"> </w:t>
+      </w:r>
+      <w:r>
+        <w:rPr>
+          <w:rStyle w:val="VerbatimChar"/>
+        </w:rPr>
+        <w:t xml:space="preserve">-race</w:t>
+      </w:r>
+      <w:r>
+        <w:t xml:space="preserve">, proving the Registry never oversubscribes (mutex removal trips the race detector) (HXC-910, closing a wave-67 follow-up).</w:t>
+      </w:r>
+    </w:p>
+    <w:p>
+      <w:pPr>
+        <w:pStyle w:val="Compact"/>
+        <w:numPr>
+          <w:ilvl w:val="2"/>
+          <w:numId w:val="1006"/>
+        </w:numPr>
+      </w:pPr>
+      <w:r>
+        <w:rPr>
+          <w:rStyle w:val="VerbatimChar"/>
+        </w:rPr>
+        <w:t xml:space="preserve">internal/llm</w:t>
+      </w:r>
+      <w:r>
+        <w:t xml:space="preserve"> </w:t>
+      </w:r>
+      <w:r>
+        <w:t xml:space="preserve">— replaced the stub</w:t>
+      </w:r>
+      <w:r>
+        <w:t xml:space="preserve"> </w:t>
+      </w:r>
+      <w:r>
+        <w:rPr>
+          <w:rStyle w:val="VerbatimChar"/>
+        </w:rPr>
+        <w:t xml:space="preserve">Inference</w:t>
+      </w:r>
+      <w:r>
+        <w:t xml:space="preserve"> </w:t>
+      </w:r>
+      <w:r>
+        <w:t xml:space="preserve">with a real strategy-based router (latency/throughput/quality/cost) over the live model registry, excluding unhealthy/unloaded models with a typed no-eligible-model error and a real injectable</w:t>
+      </w:r>
+      <w:r>
+        <w:t xml:space="preserve"> </w:t>
+      </w:r>
+      <w:r>
+        <w:rPr>
+          <w:rStyle w:val="VerbatimChar"/>
+        </w:rPr>
+        <w:t xml:space="preserve">Backend</w:t>
+      </w:r>
+      <w:r>
+        <w:t xml:space="preserve"> </w:t>
+      </w:r>
+      <w:r>
+        <w:t xml:space="preserve">seam (HXC-1470).</w:t>
+      </w:r>
+    </w:p>
+    <w:p>
+      <w:pPr>
+        <w:pStyle w:val="Compact"/>
+        <w:numPr>
+          <w:ilvl w:val="2"/>
+          <w:numId w:val="1006"/>
+        </w:numPr>
+      </w:pPr>
+      <w:r>
+        <w:rPr>
+          <w:rStyle w:val="VerbatimChar"/>
+        </w:rPr>
+        <w:t xml:space="preserve">metrics</w:t>
+      </w:r>
+      <w:r>
+        <w:t xml:space="preserve"> </w:t>
+      </w:r>
+      <w:r>
+        <w:t xml:space="preserve">(additive</w:t>
+      </w:r>
+      <w:r>
+        <w:t xml:space="preserve"> </w:t>
+      </w:r>
+      <w:r>
+        <w:rPr>
+          <w:rStyle w:val="VerbatimChar"/>
+        </w:rPr>
+        <w:t xml:space="preserve">earningsmetrics.go</w:t>
+      </w:r>
+      <w:r>
+        <w:t xml:space="preserve">) —</w:t>
+      </w:r>
+      <w:r>
+        <w:t xml:space="preserve"> </w:t>
+      </w:r>
+      <w:r>
+        <w:rPr>
+          <w:rStyle w:val="VerbatimChar"/>
+        </w:rPr>
+        <w:t xml:space="preserve">EarningsMetrics</w:t>
+      </w:r>
+      <w:r>
+        <w:t xml:space="preserve"> </w:t>
+      </w:r>
+      <w:r>
+        <w:t xml:space="preserve">exposing</w:t>
+      </w:r>
+      <w:r>
+        <w:t xml:space="preserve"> </w:t>
+      </w:r>
+      <w:r>
+        <w:rPr>
+          <w:rStyle w:val="VerbatimChar"/>
+        </w:rPr>
+        <w:t xml:space="preserve">tao_earnings_total</w:t>
+      </w:r>
+      <w:r>
+        <w:t xml:space="preserve"> </w:t>
+      </w:r>
+      <w:r>
+        <w:t xml:space="preserve">/</w:t>
+      </w:r>
+      <w:r>
+        <w:t xml:space="preserve"> </w:t>
+      </w:r>
+      <w:r>
+        <w:rPr>
+          <w:rStyle w:val="VerbatimChar"/>
+        </w:rPr>
+        <w:t xml:space="preserve">graval_attestation_status</w:t>
+      </w:r>
+      <w:r>
+        <w:t xml:space="preserve"> </w:t>
+      </w:r>
+      <w:r>
+        <w:t xml:space="preserve">/</w:t>
+      </w:r>
+      <w:r>
+        <w:t xml:space="preserve"> </w:t>
+      </w:r>
+      <w:r>
+        <w:rPr>
+          <w:rStyle w:val="VerbatimChar"/>
+        </w:rPr>
+        <w:t xml:space="preserve">token_throughput</w:t>
+      </w:r>
+      <w:r>
+        <w:t xml:space="preserve"> </w:t>
+      </w:r>
+      <w:r>
+        <w:t xml:space="preserve">/</w:t>
+      </w:r>
+      <w:r>
+        <w:t xml:space="preserve"> </w:t>
+      </w:r>
+      <w:r>
+        <w:rPr>
+          <w:rStyle w:val="VerbatimChar"/>
+        </w:rPr>
+        <w:t xml:space="preserve">gpu_utilization</w:t>
+      </w:r>
+      <w:r>
+        <w:t xml:space="preserve"> </w:t>
+      </w:r>
+      <w:r>
+        <w:t xml:space="preserve">Prometheus-text series with deterministic (sorted) ordering + concurrent-safe setters (HXC-1483).</w:t>
+      </w:r>
+    </w:p>
+    <w:p>
+      <w:pPr>
+        <w:pStyle w:val="Compact"/>
+        <w:numPr>
+          <w:ilvl w:val="2"/>
+          <w:numId w:val="1006"/>
+        </w:numPr>
+      </w:pPr>
+      <w:r>
+        <w:rPr>
+          <w:rStyle w:val="VerbatimChar"/>
+        </w:rPr>
+        <w:t xml:space="preserve">internal/gpu</w:t>
+      </w:r>
+      <w:r>
+        <w:t xml:space="preserve"> </w:t>
+      </w:r>
+      <w:r>
+        <w:t xml:space="preserve">(additive</w:t>
+      </w:r>
+      <w:r>
+        <w:t xml:space="preserve"> </w:t>
+      </w:r>
+      <w:r>
+        <w:rPr>
+          <w:rStyle w:val="VerbatimChar"/>
+        </w:rPr>
+        <w:t xml:space="preserve">attesthook.go</w:t>
+      </w:r>
+      <w:r>
+        <w:t xml:space="preserve">) — GraVal attestation hook:</w:t>
+      </w:r>
+      <w:r>
+        <w:t xml:space="preserve"> </w:t>
+      </w:r>
+      <w:r>
+        <w:rPr>
+          <w:rStyle w:val="VerbatimChar"/>
+        </w:rPr>
+        <w:t xml:space="preserve">AllocateForChutes</w:t>
+      </w:r>
+      <w:r>
+        <w:t xml:space="preserve"> </w:t>
+      </w:r>
+      <w:r>
+        <w:t xml:space="preserve">refuses a GPU that has not passed attestation (</w:t>
+      </w:r>
+      <w:r>
+        <w:rPr>
+          <w:rStyle w:val="VerbatimChar"/>
+        </w:rPr>
+        <w:t xml:space="preserve">ErrAttestationRequired</w:t>
+      </w:r>
+      <w:r>
+        <w:t xml:space="preserve">), even on the idempotent re-allocation path; injectable</w:t>
+      </w:r>
+      <w:r>
+        <w:t xml:space="preserve"> </w:t>
+      </w:r>
+      <w:r>
+        <w:rPr>
+          <w:rStyle w:val="VerbatimChar"/>
+        </w:rPr>
+        <w:t xml:space="preserve">ChutesAttestor</w:t>
+      </w:r>
+      <w:r>
+        <w:t xml:space="preserve"> </w:t>
+      </w:r>
+      <w:r>
+        <w:t xml:space="preserve">seam (HXC-1448).</w:t>
+      </w:r>
+    </w:p>
+    <w:p>
+      <w:pPr>
+        <w:pStyle w:val="Compact"/>
+        <w:numPr>
           <w:ilvl w:val="0"/>
           <w:numId w:val="1001"/>
         </w:numPr>
@@ -2906,7 +3266,7 @@
         <w:pStyle w:val="Compact"/>
         <w:numPr>
           <w:ilvl w:val="0"/>
-          <w:numId w:val="1006"/>
+          <w:numId w:val="1007"/>
         </w:numPr>
       </w:pPr>
       <w:r>
@@ -2963,7 +3323,7 @@
         <w:pStyle w:val="Compact"/>
         <w:numPr>
           <w:ilvl w:val="0"/>
-          <w:numId w:val="1007"/>
+          <w:numId w:val="1008"/>
         </w:numPr>
       </w:pPr>
       <w:r>
@@ -3208,6 +3568,9 @@
     <w:abstractNumId w:val="991"/>
   </w:num>
   <w:num w:numId="1007">
+    <w:abstractNumId w:val="991"/>
+  </w:num>
+  <w:num w:numId="1008">
     <w:abstractNumId w:val="991"/>
   </w:num>
 </w:numbering>

</xml_diff>

<commit_message>
docs: CLAUDE-3 catalog sync for wave 70 — add provider/chutes + pool model/AWQ/gateway/MIG to README + FOUNDATION_PACKAGES + CHANGELOG; regenerate exports; docs_chain verify in-sync.
Co-Authored-By: Claude Opus 4.8 <noreply@anthropic.com>
</commit_message>
<xml_diff>
--- a/docs/export/CHANGELOG.docx
+++ b/docs/export/CHANGELOG.docx
@@ -3023,6 +3023,300 @@
       <w:pPr>
         <w:pStyle w:val="Compact"/>
         <w:numPr>
+          <w:ilvl w:val="1"/>
+          <w:numId w:val="1002"/>
+        </w:numPr>
+      </w:pPr>
+      <w:r>
+        <w:t xml:space="preserve">Wave 70 (5 units, subagent-driven, 5 parallel streams in disjoint packages, run concurrently with wave 71):</w:t>
+      </w:r>
+    </w:p>
+    <w:p>
+      <w:pPr>
+        <w:pStyle w:val="Compact"/>
+        <w:numPr>
+          <w:ilvl w:val="2"/>
+          <w:numId w:val="1007"/>
+        </w:numPr>
+      </w:pPr>
+      <w:r>
+        <w:rPr>
+          <w:rStyle w:val="VerbatimChar"/>
+        </w:rPr>
+        <w:t xml:space="preserve">provider/chutes</w:t>
+      </w:r>
+      <w:r>
+        <w:t xml:space="preserve"> </w:t>
+      </w:r>
+      <w:r>
+        <w:t xml:space="preserve">— OpenAI-compatible</w:t>
+      </w:r>
+      <w:r>
+        <w:t xml:space="preserve"> </w:t>
+      </w:r>
+      <w:r>
+        <w:rPr>
+          <w:rStyle w:val="VerbatimChar"/>
+        </w:rPr>
+        <w:t xml:space="preserve">/v1/chat/completions</w:t>
+      </w:r>
+      <w:r>
+        <w:t xml:space="preserve"> </w:t>
+      </w:r>
+      <w:r>
+        <w:t xml:space="preserve">provider (</w:t>
+      </w:r>
+      <w:r>
+        <w:rPr>
+          <w:rStyle w:val="VerbatimChar"/>
+        </w:rPr>
+        <w:t xml:space="preserve">cpk_</w:t>
+      </w:r>
+      <w:r>
+        <w:t xml:space="preserve"> </w:t>
+      </w:r>
+      <w:r>
+        <w:t xml:space="preserve">Bearer) with HTTP-429 retry+backoff; httptest proves retry-then-success, Bearer header, and typed errors (HXC-1510).</w:t>
+      </w:r>
+    </w:p>
+    <w:p>
+      <w:pPr>
+        <w:pStyle w:val="Compact"/>
+        <w:numPr>
+          <w:ilvl w:val="2"/>
+          <w:numId w:val="1007"/>
+        </w:numPr>
+      </w:pPr>
+      <w:r>
+        <w:rPr>
+          <w:rStyle w:val="VerbatimChar"/>
+        </w:rPr>
+        <w:t xml:space="preserve">pool</w:t>
+      </w:r>
+      <w:r>
+        <w:t xml:space="preserve"> </w:t>
+      </w:r>
+      <w:r>
+        <w:t xml:space="preserve">(additive</w:t>
+      </w:r>
+      <w:r>
+        <w:t xml:space="preserve"> </w:t>
+      </w:r>
+      <w:r>
+        <w:rPr>
+          <w:rStyle w:val="VerbatimChar"/>
+        </w:rPr>
+        <w:t xml:space="preserve">model.go</w:t>
+      </w:r>
+      <w:r>
+        <w:t xml:space="preserve">) —</w:t>
+      </w:r>
+      <w:r>
+        <w:t xml:space="preserve"> </w:t>
+      </w:r>
+      <w:r>
+        <w:rPr>
+          <w:rStyle w:val="VerbatimChar"/>
+        </w:rPr>
+        <w:t xml:space="preserve">GPUDevice</w:t>
+      </w:r>
+      <w:r>
+        <w:t xml:space="preserve">/</w:t>
+      </w:r>
+      <w:r>
+        <w:rPr>
+          <w:rStyle w:val="VerbatimChar"/>
+        </w:rPr>
+        <w:t xml:space="preserve">WorkloadSpec</w:t>
+      </w:r>
+      <w:r>
+        <w:t xml:space="preserve">/</w:t>
+      </w:r>
+      <w:r>
+        <w:rPr>
+          <w:rStyle w:val="VerbatimChar"/>
+        </w:rPr>
+        <w:t xml:space="preserve">GPUAllocation</w:t>
+      </w:r>
+      <w:r>
+        <w:t xml:space="preserve">/</w:t>
+      </w:r>
+      <w:r>
+        <w:rPr>
+          <w:rStyle w:val="VerbatimChar"/>
+        </w:rPr>
+        <w:t xml:space="preserve">PoolStatus</w:t>
+      </w:r>
+      <w:r>
+        <w:t xml:space="preserve"> </w:t>
+      </w:r>
+      <w:r>
+        <w:t xml:space="preserve">data model with snake_case JSON tags + round-trip/concurrency tests (HXC-1495).</w:t>
+      </w:r>
+    </w:p>
+    <w:p>
+      <w:pPr>
+        <w:pStyle w:val="Compact"/>
+        <w:numPr>
+          <w:ilvl w:val="2"/>
+          <w:numId w:val="1007"/>
+        </w:numPr>
+      </w:pPr>
+      <w:r>
+        <w:rPr>
+          <w:rStyle w:val="VerbatimChar"/>
+        </w:rPr>
+        <w:t xml:space="preserve">quantization</w:t>
+      </w:r>
+      <w:r>
+        <w:t xml:space="preserve"> </w:t>
+      </w:r>
+      <w:r>
+        <w:t xml:space="preserve">(additive</w:t>
+      </w:r>
+      <w:r>
+        <w:t xml:space="preserve"> </w:t>
+      </w:r>
+      <w:r>
+        <w:rPr>
+          <w:rStyle w:val="VerbatimChar"/>
+        </w:rPr>
+        <w:t xml:space="preserve">awq.go</w:t>
+      </w:r>
+      <w:r>
+        <w:t xml:space="preserve">) — AWQ 4-bit default serving format +</w:t>
+      </w:r>
+      <w:r>
+        <w:t xml:space="preserve"> </w:t>
+      </w:r>
+      <w:r>
+        <w:rPr>
+          <w:rStyle w:val="VerbatimChar"/>
+        </w:rPr>
+        <w:t xml:space="preserve">EstimateVRAM</w:t>
+      </w:r>
+      <w:r>
+        <w:t xml:space="preserve"> </w:t>
+      </w:r>
+      <w:r>
+        <w:t xml:space="preserve">(~25% of fp16) + budget-aware</w:t>
+      </w:r>
+      <w:r>
+        <w:t xml:space="preserve"> </w:t>
+      </w:r>
+      <w:r>
+        <w:rPr>
+          <w:rStyle w:val="VerbatimChar"/>
+        </w:rPr>
+        <w:t xml:space="preserve">SelectFormat</w:t>
+      </w:r>
+      <w:r>
+        <w:t xml:space="preserve"> </w:t>
+      </w:r>
+      <w:r>
+        <w:t xml:space="preserve">preferring AWQ when fp16 won’t fit (HXC-1473).</w:t>
+      </w:r>
+    </w:p>
+    <w:p>
+      <w:pPr>
+        <w:pStyle w:val="Compact"/>
+        <w:numPr>
+          <w:ilvl w:val="2"/>
+          <w:numId w:val="1007"/>
+        </w:numPr>
+      </w:pPr>
+      <w:r>
+        <w:rPr>
+          <w:rStyle w:val="VerbatimChar"/>
+        </w:rPr>
+        <w:t xml:space="preserve">internal/gateway</w:t>
+      </w:r>
+      <w:r>
+        <w:t xml:space="preserve"> </w:t>
+      </w:r>
+      <w:r>
+        <w:t xml:space="preserve">(additive</w:t>
+      </w:r>
+      <w:r>
+        <w:t xml:space="preserve"> </w:t>
+      </w:r>
+      <w:r>
+        <w:rPr>
+          <w:rStyle w:val="VerbatimChar"/>
+        </w:rPr>
+        <w:t xml:space="preserve">inference.go</w:t>
+      </w:r>
+      <w:r>
+        <w:t xml:space="preserve">) — inference route forwarding to an injectable Chutes client;</w:t>
+      </w:r>
+      <w:r>
+        <w:t xml:space="preserve"> </w:t>
+      </w:r>
+      <w:r>
+        <w:rPr>
+          <w:rStyle w:val="VerbatimChar"/>
+        </w:rPr>
+        <w:t xml:space="preserve">TEERequired</w:t>
+      </w:r>
+      <w:r>
+        <w:t xml:space="preserve"> </w:t>
+      </w:r>
+      <w:r>
+        <w:t xml:space="preserve">=&gt;</w:t>
+      </w:r>
+      <w:r>
+        <w:t xml:space="preserve"> </w:t>
+      </w:r>
+      <w:r>
+        <w:rPr>
+          <w:rStyle w:val="VerbatimChar"/>
+        </w:rPr>
+        <w:t xml:space="preserve">X-E2EE-Enabled</w:t>
+      </w:r>
+      <w:r>
+        <w:t xml:space="preserve"> </w:t>
+      </w:r>
+      <w:r>
+        <w:t xml:space="preserve">routing marker; client failure =&gt; 502 (HXC-1469).</w:t>
+      </w:r>
+    </w:p>
+    <w:p>
+      <w:pPr>
+        <w:pStyle w:val="Compact"/>
+        <w:numPr>
+          <w:ilvl w:val="2"/>
+          <w:numId w:val="1007"/>
+        </w:numPr>
+      </w:pPr>
+      <w:r>
+        <w:rPr>
+          <w:rStyle w:val="VerbatimChar"/>
+        </w:rPr>
+        <w:t xml:space="preserve">internal/gpu</w:t>
+      </w:r>
+      <w:r>
+        <w:t xml:space="preserve"> </w:t>
+      </w:r>
+      <w:r>
+        <w:t xml:space="preserve">(additive</w:t>
+      </w:r>
+      <w:r>
+        <w:t xml:space="preserve"> </w:t>
+      </w:r>
+      <w:r>
+        <w:rPr>
+          <w:rStyle w:val="VerbatimChar"/>
+        </w:rPr>
+        <w:t xml:space="preserve">mig.go</w:t>
+      </w:r>
+      <w:r>
+        <w:t xml:space="preserve">) — MIG profile management: standardized vGPU tiers (1g.10gb/2g.20gb/3g.40gb/7g.80gb), in-memory partitioning with oversubscription rejection + fixed-at-creation immutability (HXC-1449).</w:t>
+      </w:r>
+    </w:p>
+    <w:p>
+      <w:pPr>
+        <w:pStyle w:val="Compact"/>
+        <w:numPr>
           <w:ilvl w:val="0"/>
           <w:numId w:val="1001"/>
         </w:numPr>
@@ -3266,7 +3560,7 @@
         <w:pStyle w:val="Compact"/>
         <w:numPr>
           <w:ilvl w:val="0"/>
-          <w:numId w:val="1007"/>
+          <w:numId w:val="1008"/>
         </w:numPr>
       </w:pPr>
       <w:r>
@@ -3323,7 +3617,7 @@
         <w:pStyle w:val="Compact"/>
         <w:numPr>
           <w:ilvl w:val="0"/>
-          <w:numId w:val="1008"/>
+          <w:numId w:val="1009"/>
         </w:numPr>
       </w:pPr>
       <w:r>
@@ -3571,6 +3865,9 @@
     <w:abstractNumId w:val="991"/>
   </w:num>
   <w:num w:numId="1008">
+    <w:abstractNumId w:val="991"/>
+  </w:num>
+  <w:num w:numId="1009">
     <w:abstractNumId w:val="991"/>
   </w:num>
 </w:numbering>

</xml_diff>

<commit_message>
docs: CLAUDE-3 catalog sync for wave 71 — multiraft async-safety, kraft ErrTopicExists, porcupine memoization, chutes stream-cancel, marketplaceadapter Akash; regenerate exports; docs_chain verify in-sync.
Co-Authored-By: Claude Opus 4.8 <noreply@anthropic.com>
</commit_message>
<xml_diff>
--- a/docs/export/CHANGELOG.docx
+++ b/docs/export/CHANGELOG.docx
@@ -3317,6 +3317,231 @@
       <w:pPr>
         <w:pStyle w:val="Compact"/>
         <w:numPr>
+          <w:ilvl w:val="1"/>
+          <w:numId w:val="1002"/>
+        </w:numPr>
+      </w:pPr>
+      <w:r>
+        <w:t xml:space="preserve">Wave 71 (5 units, subagent-driven, 5 parallel streams in disjoint packages, run concurrently with wave 70; closes 4 prior follow-ups):</w:t>
+      </w:r>
+    </w:p>
+    <w:p>
+      <w:pPr>
+        <w:pStyle w:val="Compact"/>
+        <w:numPr>
+          <w:ilvl w:val="2"/>
+          <w:numId w:val="1008"/>
+        </w:numPr>
+      </w:pPr>
+      <w:r>
+        <w:rPr>
+          <w:rStyle w:val="VerbatimChar"/>
+        </w:rPr>
+        <w:t xml:space="preserve">multiraft</w:t>
+      </w:r>
+      <w:r>
+        <w:t xml:space="preserve"> </w:t>
+      </w:r>
+      <w:r>
+        <w:t xml:space="preserve">— RaftTransport async-delivery safety: inbox handler Steps under the shard mutex, outbound messages deferred + flushed after unlock; a new async-transport</w:t>
+      </w:r>
+      <w:r>
+        <w:t xml:space="preserve"> </w:t>
+      </w:r>
+      <w:r>
+        <w:rPr>
+          <w:rStyle w:val="VerbatimChar"/>
+        </w:rPr>
+        <w:t xml:space="preserve">-race</w:t>
+      </w:r>
+      <w:r>
+        <w:t xml:space="preserve"> </w:t>
+      </w:r>
+      <w:r>
+        <w:t xml:space="preserve">test proves a goroutine-delivering transport is race-free and still commits (HXC-909).</w:t>
+      </w:r>
+    </w:p>
+    <w:p>
+      <w:pPr>
+        <w:pStyle w:val="Compact"/>
+        <w:numPr>
+          <w:ilvl w:val="2"/>
+          <w:numId w:val="1008"/>
+        </w:numPr>
+      </w:pPr>
+      <w:r>
+        <w:rPr>
+          <w:rStyle w:val="VerbatimChar"/>
+        </w:rPr>
+        <w:t xml:space="preserve">kraft</w:t>
+      </w:r>
+      <w:r>
+        <w:t xml:space="preserve"> </w:t>
+      </w:r>
+      <w:r>
+        <w:t xml:space="preserve">—</w:t>
+      </w:r>
+      <w:r>
+        <w:t xml:space="preserve"> </w:t>
+      </w:r>
+      <w:r>
+        <w:rPr>
+          <w:rStyle w:val="VerbatimChar"/>
+        </w:rPr>
+        <w:t xml:space="preserve">CreateTopic</w:t>
+      </w:r>
+      <w:r>
+        <w:t xml:space="preserve"> </w:t>
+      </w:r>
+      <w:r>
+        <w:t xml:space="preserve">returns</w:t>
+      </w:r>
+      <w:r>
+        <w:t xml:space="preserve"> </w:t>
+      </w:r>
+      <w:r>
+        <w:rPr>
+          <w:rStyle w:val="VerbatimChar"/>
+        </w:rPr>
+        <w:t xml:space="preserve">ErrTopicExists</w:t>
+      </w:r>
+      <w:r>
+        <w:t xml:space="preserve"> </w:t>
+      </w:r>
+      <w:r>
+        <w:t xml:space="preserve">on a conflicting re-create (different partition count); identical re-create stays idempotent (HXC-912).</w:t>
+      </w:r>
+    </w:p>
+    <w:p>
+      <w:pPr>
+        <w:pStyle w:val="Compact"/>
+        <w:numPr>
+          <w:ilvl w:val="2"/>
+          <w:numId w:val="1008"/>
+        </w:numPr>
+      </w:pPr>
+      <w:r>
+        <w:rPr>
+          <w:rStyle w:val="VerbatimChar"/>
+        </w:rPr>
+        <w:t xml:space="preserve">porcupine</w:t>
+      </w:r>
+      <w:r>
+        <w:t xml:space="preserve"> </w:t>
+      </w:r>
+      <w:r>
+        <w:t xml:space="preserve">— WGL state-dedup memoization via</w:t>
+      </w:r>
+      <w:r>
+        <w:t xml:space="preserve"> </w:t>
+      </w:r>
+      <w:r>
+        <w:rPr>
+          <w:rStyle w:val="VerbatimChar"/>
+        </w:rPr>
+        <w:t xml:space="preserve">Model.Equal</w:t>
+      </w:r>
+      <w:r>
+        <w:t xml:space="preserve">: verdict-preserving pruning (memo fires on backtracking histories; identical PASS/FAIL + witness vs</w:t>
+      </w:r>
+      <w:r>
+        <w:t xml:space="preserve"> </w:t>
+      </w:r>
+      <w:r>
+        <w:rPr>
+          <w:rStyle w:val="VerbatimChar"/>
+        </w:rPr>
+        <w:t xml:space="preserve">Equal==nil</w:t>
+      </w:r>
+      <w:r>
+        <w:t xml:space="preserve">) (HXC-913).</w:t>
+      </w:r>
+    </w:p>
+    <w:p>
+      <w:pPr>
+        <w:pStyle w:val="Compact"/>
+        <w:numPr>
+          <w:ilvl w:val="2"/>
+          <w:numId w:val="1008"/>
+        </w:numPr>
+      </w:pPr>
+      <w:r>
+        <w:rPr>
+          <w:rStyle w:val="VerbatimChar"/>
+        </w:rPr>
+        <w:t xml:space="preserve">chutes</w:t>
+      </w:r>
+      <w:r>
+        <w:t xml:space="preserve"> </w:t>
+      </w:r>
+      <w:r>
+        <w:t xml:space="preserve">—</w:t>
+      </w:r>
+      <w:r>
+        <w:t xml:space="preserve"> </w:t>
+      </w:r>
+      <w:r>
+        <w:rPr>
+          <w:rStyle w:val="VerbatimChar"/>
+        </w:rPr>
+        <w:t xml:space="preserve">StreamChannel</w:t>
+      </w:r>
+      <w:r>
+        <w:t xml:space="preserve"> </w:t>
+      </w:r>
+      <w:r>
+        <w:t xml:space="preserve">honors ctx cancellation on a blocked read (prompt channel close, no goroutine leak) and closes the owned reader (HXC-911).</w:t>
+      </w:r>
+    </w:p>
+    <w:p>
+      <w:pPr>
+        <w:pStyle w:val="Compact"/>
+        <w:numPr>
+          <w:ilvl w:val="2"/>
+          <w:numId w:val="1008"/>
+        </w:numPr>
+      </w:pPr>
+      <w:r>
+        <w:rPr>
+          <w:rStyle w:val="VerbatimChar"/>
+        </w:rPr>
+        <w:t xml:space="preserve">marketplaceadapter</w:t>
+      </w:r>
+      <w:r>
+        <w:t xml:space="preserve"> </w:t>
+      </w:r>
+      <w:r>
+        <w:t xml:space="preserve">(additive</w:t>
+      </w:r>
+      <w:r>
+        <w:t xml:space="preserve"> </w:t>
+      </w:r>
+      <w:r>
+        <w:rPr>
+          <w:rStyle w:val="VerbatimChar"/>
+        </w:rPr>
+        <w:t xml:space="preserve">akash.go</w:t>
+      </w:r>
+      <w:r>
+        <w:t xml:space="preserve">) — Akash (Cosmos/AKT) adapter over an injectable client: reverse-auction pricing, SDL submission, provider-reputation gate, registered in the</w:t>
+      </w:r>
+      <w:r>
+        <w:t xml:space="preserve"> </w:t>
+      </w:r>
+      <w:r>
+        <w:rPr>
+          <w:rStyle w:val="VerbatimChar"/>
+        </w:rPr>
+        <w:t xml:space="preserve">Name()</w:t>
+      </w:r>
+      <w:r>
+        <w:t xml:space="preserve">-dispatch Registry (HXC-1458).</w:t>
+      </w:r>
+    </w:p>
+    <w:p>
+      <w:pPr>
+        <w:pStyle w:val="Compact"/>
+        <w:numPr>
           <w:ilvl w:val="0"/>
           <w:numId w:val="1001"/>
         </w:numPr>
@@ -3560,7 +3785,7 @@
         <w:pStyle w:val="Compact"/>
         <w:numPr>
           <w:ilvl w:val="0"/>
-          <w:numId w:val="1008"/>
+          <w:numId w:val="1009"/>
         </w:numPr>
       </w:pPr>
       <w:r>
@@ -3617,7 +3842,7 @@
         <w:pStyle w:val="Compact"/>
         <w:numPr>
           <w:ilvl w:val="0"/>
-          <w:numId w:val="1009"/>
+          <w:numId w:val="1010"/>
         </w:numPr>
       </w:pPr>
       <w:r>
@@ -3868,6 +4093,9 @@
     <w:abstractNumId w:val="991"/>
   </w:num>
   <w:num w:numId="1009">
+    <w:abstractNumId w:val="991"/>
+  </w:num>
+  <w:num w:numId="1010">
     <w:abstractNumId w:val="991"/>
   </w:num>
 </w:numbering>

</xml_diff>

<commit_message>
docs: CLAUDE-3 catalog sync for wave 72 — provider/runpod + provider/aws + scheduler tier filter + chutes Retry-After + grafanadash tier dashboard; regenerate exports; docs_chain verify in-sync.
Co-Authored-By: Claude Opus 4.8 <noreply@anthropic.com>
</commit_message>
<xml_diff>
--- a/docs/export/CHANGELOG.docx
+++ b/docs/export/CHANGELOG.docx
@@ -3542,6 +3542,219 @@
       <w:pPr>
         <w:pStyle w:val="Compact"/>
         <w:numPr>
+          <w:ilvl w:val="1"/>
+          <w:numId w:val="1002"/>
+        </w:numPr>
+      </w:pPr>
+      <w:r>
+        <w:t xml:space="preserve">Wave 72 (5 units, subagent-driven, 5 parallel streams in disjoint packages):</w:t>
+      </w:r>
+    </w:p>
+    <w:p>
+      <w:pPr>
+        <w:pStyle w:val="Compact"/>
+        <w:numPr>
+          <w:ilvl w:val="2"/>
+          <w:numId w:val="1009"/>
+        </w:numPr>
+      </w:pPr>
+      <w:r>
+        <w:rPr>
+          <w:rStyle w:val="VerbatimChar"/>
+        </w:rPr>
+        <w:t xml:space="preserve">provider/runpod</w:t>
+      </w:r>
+      <w:r>
+        <w:t xml:space="preserve"> </w:t>
+      </w:r>
+      <w:r>
+        <w:t xml:space="preserve">— RunPodProvider (implements</w:t>
+      </w:r>
+      <w:r>
+        <w:t xml:space="preserve"> </w:t>
+      </w:r>
+      <w:r>
+        <w:rPr>
+          <w:rStyle w:val="VerbatimChar"/>
+        </w:rPr>
+        <w:t xml:space="preserve">pool.GPUProvider</w:t>
+      </w:r>
+      <w:r>
+        <w:t xml:space="preserve">) with a warm-pool fast path over an injectable client (HXC-1515).</w:t>
+      </w:r>
+    </w:p>
+    <w:p>
+      <w:pPr>
+        <w:pStyle w:val="Compact"/>
+        <w:numPr>
+          <w:ilvl w:val="2"/>
+          <w:numId w:val="1009"/>
+        </w:numPr>
+      </w:pPr>
+      <w:r>
+        <w:rPr>
+          <w:rStyle w:val="VerbatimChar"/>
+        </w:rPr>
+        <w:t xml:space="preserve">provider/aws</w:t>
+      </w:r>
+      <w:r>
+        <w:t xml:space="preserve"> </w:t>
+      </w:r>
+      <w:r>
+        <w:t xml:space="preserve">— AWSProvider EC2 Spot adapter over an injectable EC2-client interface (no aws-sdk dep): GPU model→instance-type selection (p5/p4de/g5), Spot+tags, TOCTOU-safe capacity gate (HXC-1516).</w:t>
+      </w:r>
+    </w:p>
+    <w:p>
+      <w:pPr>
+        <w:pStyle w:val="Compact"/>
+        <w:numPr>
+          <w:ilvl w:val="2"/>
+          <w:numId w:val="1009"/>
+        </w:numPr>
+      </w:pPr>
+      <w:r>
+        <w:rPr>
+          <w:rStyle w:val="VerbatimChar"/>
+        </w:rPr>
+        <w:t xml:space="preserve">scheduler</w:t>
+      </w:r>
+      <w:r>
+        <w:t xml:space="preserve"> </w:t>
+      </w:r>
+      <w:r>
+        <w:t xml:space="preserve">(additive</w:t>
+      </w:r>
+      <w:r>
+        <w:t xml:space="preserve"> </w:t>
+      </w:r>
+      <w:r>
+        <w:rPr>
+          <w:rStyle w:val="VerbatimChar"/>
+        </w:rPr>
+        <w:t xml:space="preserve">tier_filter.go</w:t>
+      </w:r>
+      <w:r>
+        <w:t xml:space="preserve">) — GPUTier-aware filter predicate: hard-exclude disallowed tiers + preference scoring, composes with the existing count filter, fails closed on a nil predicate (HXC-1534).</w:t>
+      </w:r>
+    </w:p>
+    <w:p>
+      <w:pPr>
+        <w:pStyle w:val="Compact"/>
+        <w:numPr>
+          <w:ilvl w:val="2"/>
+          <w:numId w:val="1009"/>
+        </w:numPr>
+      </w:pPr>
+      <w:r>
+        <w:rPr>
+          <w:rStyle w:val="VerbatimChar"/>
+        </w:rPr>
+        <w:t xml:space="preserve">provider/chutes</w:t>
+      </w:r>
+      <w:r>
+        <w:t xml:space="preserve"> </w:t>
+      </w:r>
+      <w:r>
+        <w:t xml:space="preserve">— ctx-interruptible 429 backoff (select vs</w:t>
+      </w:r>
+      <w:r>
+        <w:t xml:space="preserve"> </w:t>
+      </w:r>
+      <w:r>
+        <w:rPr>
+          <w:rStyle w:val="VerbatimChar"/>
+        </w:rPr>
+        <w:t xml:space="preserve">ctx.Done()</w:t>
+      </w:r>
+      <w:r>
+        <w:t xml:space="preserve">) + honors</w:t>
+      </w:r>
+      <w:r>
+        <w:t xml:space="preserve"> </w:t>
+      </w:r>
+      <w:r>
+        <w:rPr>
+          <w:rStyle w:val="VerbatimChar"/>
+        </w:rPr>
+        <w:t xml:space="preserve">Retry-After</w:t>
+      </w:r>
+      <w:r>
+        <w:t xml:space="preserve"> </w:t>
+      </w:r>
+      <w:r>
+        <w:t xml:space="preserve">(delta-seconds/HTTP-date,</w:t>
+      </w:r>
+      <w:r>
+        <w:t xml:space="preserve"> </w:t>
+      </w:r>
+      <w:r>
+        <w:rPr>
+          <w:rStyle w:val="VerbatimChar"/>
+        </w:rPr>
+        <w:t xml:space="preserve">max(hint,backoff)</w:t>
+      </w:r>
+      <w:r>
+        <w:t xml:space="preserve">) (HXC-916, closing a wave-70 follow-up).</w:t>
+      </w:r>
+    </w:p>
+    <w:p>
+      <w:pPr>
+        <w:pStyle w:val="Compact"/>
+        <w:numPr>
+          <w:ilvl w:val="2"/>
+          <w:numId w:val="1009"/>
+        </w:numPr>
+      </w:pPr>
+      <w:r>
+        <w:rPr>
+          <w:rStyle w:val="VerbatimChar"/>
+        </w:rPr>
+        <w:t xml:space="preserve">grafanadash</w:t>
+      </w:r>
+      <w:r>
+        <w:t xml:space="preserve"> </w:t>
+      </w:r>
+      <w:r>
+        <w:t xml:space="preserve">(additive</w:t>
+      </w:r>
+      <w:r>
+        <w:t xml:space="preserve"> </w:t>
+      </w:r>
+      <w:r>
+        <w:rPr>
+          <w:rStyle w:val="VerbatimChar"/>
+        </w:rPr>
+        <w:t xml:space="preserve">tiercost_dash.go</w:t>
+      </w:r>
+      <w:r>
+        <w:t xml:space="preserve">) — Phase-8B tier-utilization + cost dashboard generator (panels target</w:t>
+      </w:r>
+      <w:r>
+        <w:t xml:space="preserve"> </w:t>
+      </w:r>
+      <w:r>
+        <w:rPr>
+          <w:rStyle w:val="VerbatimChar"/>
+        </w:rPr>
+        <w:t xml:space="preserve">gpu_tier_utilization</w:t>
+      </w:r>
+      <w:r>
+        <w:t xml:space="preserve">/</w:t>
+      </w:r>
+      <w:r>
+        <w:rPr>
+          <w:rStyle w:val="VerbatimChar"/>
+        </w:rPr>
+        <w:t xml:space="preserve">gpu_cost_per_hour</w:t>
+      </w:r>
+      <w:r>
+        <w:t xml:space="preserve">), valid + deterministic (HXC-1551).</w:t>
+      </w:r>
+    </w:p>
+    <w:p>
+      <w:pPr>
+        <w:pStyle w:val="Compact"/>
+        <w:numPr>
           <w:ilvl w:val="0"/>
           <w:numId w:val="1001"/>
         </w:numPr>
@@ -3785,7 +3998,7 @@
         <w:pStyle w:val="Compact"/>
         <w:numPr>
           <w:ilvl w:val="0"/>
-          <w:numId w:val="1009"/>
+          <w:numId w:val="1010"/>
         </w:numPr>
       </w:pPr>
       <w:r>
@@ -3842,7 +4055,7 @@
         <w:pStyle w:val="Compact"/>
         <w:numPr>
           <w:ilvl w:val="0"/>
-          <w:numId w:val="1010"/>
+          <w:numId w:val="1011"/>
         </w:numPr>
       </w:pPr>
       <w:r>
@@ -4096,6 +4309,9 @@
     <w:abstractNumId w:val="991"/>
   </w:num>
   <w:num w:numId="1010">
+    <w:abstractNumId w:val="991"/>
+  </w:num>
+  <w:num w:numId="1011">
     <w:abstractNumId w:val="991"/>
   </w:num>
 </w:numbering>

</xml_diff>

<commit_message>
docs: CLAUDE-3 catalog sync for wave 73 — provider/ionet + gitops ApplicationSet + internal/federation Karmada + health miner/GraVal + discovery mDNS; HXC-904 podman build-service reconciliation; regenerate exports; docs_chain verify in-sync.
README pkg matrix, CHANGELOG Unreleased, and docs/FOUNDATION_PACKAGES.md updated
for the 5 wave-73 packages (+ the HXC-904 podman build-service note); html/pdf/docx
exports regenerated via docs_chain sync (tracked_docs context); docs_chain verify
--all = in-sync. Evidence: qa-results/docs_chain/20260603T025515Z.

Co-Authored-By: Claude Opus 4.8 <noreply@anthropic.com>
</commit_message>
<xml_diff>
--- a/docs/export/CHANGELOG.docx
+++ b/docs/export/CHANGELOG.docx
@@ -3755,6 +3755,330 @@
       <w:pPr>
         <w:pStyle w:val="Compact"/>
         <w:numPr>
+          <w:ilvl w:val="1"/>
+          <w:numId w:val="1002"/>
+        </w:numPr>
+      </w:pPr>
+      <w:r>
+        <w:t xml:space="preserve">Wave 73 (5 units, subagent-driven, 5 parallel streams in disjoint packages; impl→spec-review→quality-review + independent build/vet/-race/mutation gate):</w:t>
+      </w:r>
+    </w:p>
+    <w:p>
+      <w:pPr>
+        <w:pStyle w:val="Compact"/>
+        <w:numPr>
+          <w:ilvl w:val="2"/>
+          <w:numId w:val="1010"/>
+        </w:numPr>
+      </w:pPr>
+      <w:r>
+        <w:rPr>
+          <w:rStyle w:val="VerbatimChar"/>
+        </w:rPr>
+        <w:t xml:space="preserve">provider/ionet</w:t>
+      </w:r>
+      <w:r>
+        <w:t xml:space="preserve"> </w:t>
+      </w:r>
+      <w:r>
+        <w:t xml:space="preserve">— IONetProvider over the io.net REST API (implements</w:t>
+      </w:r>
+      <w:r>
+        <w:t xml:space="preserve"> </w:t>
+      </w:r>
+      <w:r>
+        <w:rPr>
+          <w:rStyle w:val="VerbatimChar"/>
+        </w:rPr>
+        <w:t xml:space="preserve">pool.GPUProvider</w:t>
+      </w:r>
+      <w:r>
+        <w:t xml:space="preserve">, injectable base URL +</w:t>
+      </w:r>
+      <w:r>
+        <w:t xml:space="preserve"> </w:t>
+      </w:r>
+      <w:r>
+        <w:rPr>
+          <w:rStyle w:val="VerbatimChar"/>
+        </w:rPr>
+        <w:t xml:space="preserve">*http.Client</w:t>
+      </w:r>
+      <w:r>
+        <w:t xml:space="preserve"> </w:t>
+      </w:r>
+      <w:r>
+        <w:t xml:space="preserve">+ bearer):</w:t>
+      </w:r>
+      <w:r>
+        <w:t xml:space="preserve"> </w:t>
+      </w:r>
+      <w:r>
+        <w:rPr>
+          <w:rStyle w:val="VerbatimChar"/>
+        </w:rPr>
+        <w:t xml:space="preserve">DeployCluster</w:t>
+      </w:r>
+      <w:r>
+        <w:t xml:space="preserve"> </w:t>
+      </w:r>
+      <w:r>
+        <w:t xml:space="preserve">returns the backend-minted cluster run-UUID (parsed, never fabricated),</w:t>
+      </w:r>
+      <w:r>
+        <w:t xml:space="preserve"> </w:t>
+      </w:r>
+      <w:r>
+        <w:rPr>
+          <w:rStyle w:val="VerbatimChar"/>
+        </w:rPr>
+        <w:t xml:space="preserve">HealthCheck</w:t>
+      </w:r>
+      <w:r>
+        <w:t xml:space="preserve"> </w:t>
+      </w:r>
+      <w:r>
+        <w:t xml:space="preserve">derives healthy state, concurrency-safe reserve-under-lock capacity gate; closure proven against a</w:t>
+      </w:r>
+      <w:r>
+        <w:t xml:space="preserve"> </w:t>
+      </w:r>
+      <w:r>
+        <w:rPr>
+          <w:rStyle w:val="VerbatimChar"/>
+        </w:rPr>
+        <w:t xml:space="preserve">net/http/httptest</w:t>
+      </w:r>
+      <w:r>
+        <w:t xml:space="preserve"> </w:t>
+      </w:r>
+      <w:r>
+        <w:t xml:space="preserve">io.net backend (HXC-1514).</w:t>
+      </w:r>
+    </w:p>
+    <w:p>
+      <w:pPr>
+        <w:pStyle w:val="Compact"/>
+        <w:numPr>
+          <w:ilvl w:val="2"/>
+          <w:numId w:val="1010"/>
+        </w:numPr>
+      </w:pPr>
+      <w:r>
+        <w:rPr>
+          <w:rStyle w:val="VerbatimChar"/>
+        </w:rPr>
+        <w:t xml:space="preserve">gitops</w:t>
+      </w:r>
+      <w:r>
+        <w:t xml:space="preserve"> </w:t>
+      </w:r>
+      <w:r>
+        <w:t xml:space="preserve">— ArgoCD ApplicationSet federation client: matrix generator expands one Application per cell,</w:t>
+      </w:r>
+      <w:r>
+        <w:t xml:space="preserve"> </w:t>
+      </w:r>
+      <w:r>
+        <w:rPr>
+          <w:rStyle w:val="VerbatimChar"/>
+        </w:rPr>
+        <w:t xml:space="preserve">syncPolicy</w:t>
+      </w:r>
+      <w:r>
+        <w:t xml:space="preserve"> </w:t>
+      </w:r>
+      <w:r>
+        <w:t xml:space="preserve">prune+selfHeal, RollingSync canary→tier-2 (50%)→tier-1 (25%) ordering, drift/prune detection; logic proven vs an httptest ArgoCD, strictly-live UI capture honestly skipped (follow-up HXC-922) (HXC-1367).</w:t>
+      </w:r>
+    </w:p>
+    <w:p>
+      <w:pPr>
+        <w:pStyle w:val="Compact"/>
+        <w:numPr>
+          <w:ilvl w:val="2"/>
+          <w:numId w:val="1010"/>
+        </w:numPr>
+      </w:pPr>
+      <w:r>
+        <w:rPr>
+          <w:rStyle w:val="VerbatimChar"/>
+        </w:rPr>
+        <w:t xml:space="preserve">internal/federation</w:t>
+      </w:r>
+      <w:r>
+        <w:t xml:space="preserve"> </w:t>
+      </w:r>
+      <w:r>
+        <w:t xml:space="preserve">— Karmada PropagationPolicy + OverridePolicy engine (CRs modeled as Go structs → YAML, no client-go dep) with constraint-aware (data-locality/latency/cost/compliance) two-level cell selection and failover reselect; deterministic failover proven via in-process FakeHub, live Karmada &lt;60s capture honestly skipped (follow-up HXC-924) (HXC-1364).</w:t>
+      </w:r>
+    </w:p>
+    <w:p>
+      <w:pPr>
+        <w:pStyle w:val="Compact"/>
+        <w:numPr>
+          <w:ilvl w:val="2"/>
+          <w:numId w:val="1010"/>
+        </w:numPr>
+      </w:pPr>
+      <w:r>
+        <w:rPr>
+          <w:rStyle w:val="VerbatimChar"/>
+        </w:rPr>
+        <w:t xml:space="preserve">health</w:t>
+      </w:r>
+      <w:r>
+        <w:t xml:space="preserve"> </w:t>
+      </w:r>
+      <w:r>
+        <w:t xml:space="preserve">(additive</w:t>
+      </w:r>
+      <w:r>
+        <w:t xml:space="preserve"> </w:t>
+      </w:r>
+      <w:r>
+        <w:rPr>
+          <w:rStyle w:val="VerbatimChar"/>
+        </w:rPr>
+        <w:t xml:space="preserve">miner.go</w:t>
+      </w:r>
+      <w:r>
+        <w:t xml:space="preserve">) — miner-api + GraVal bootstrap DaemonSet dependency checks wired into the health rollup, naming the specific failing check; healthy→unhealthy delta proven against an httptest miner-api (HXC-1484).</w:t>
+      </w:r>
+    </w:p>
+    <w:p>
+      <w:pPr>
+        <w:pStyle w:val="Compact"/>
+        <w:numPr>
+          <w:ilvl w:val="2"/>
+          <w:numId w:val="1010"/>
+        </w:numPr>
+      </w:pPr>
+      <w:r>
+        <w:rPr>
+          <w:rStyle w:val="VerbatimChar"/>
+        </w:rPr>
+        <w:t xml:space="preserve">discovery</w:t>
+      </w:r>
+      <w:r>
+        <w:t xml:space="preserve"> </w:t>
+      </w:r>
+      <w:r>
+        <w:t xml:space="preserve">(additive</w:t>
+      </w:r>
+      <w:r>
+        <w:t xml:space="preserve"> </w:t>
+      </w:r>
+      <w:r>
+        <w:rPr>
+          <w:rStyle w:val="VerbatimChar"/>
+        </w:rPr>
+        <w:t xml:space="preserve">mdns.go</w:t>
+      </w:r>
+      <w:r>
+        <w:t xml:space="preserve">) — mDNS/DNS-SD advertiser+browser on</w:t>
+      </w:r>
+      <w:r>
+        <w:t xml:space="preserve"> </w:t>
+      </w:r>
+      <w:r>
+        <w:rPr>
+          <w:rStyle w:val="VerbatimChar"/>
+        </w:rPr>
+        <w:t xml:space="preserve">_helix-cluster._tcp</w:t>
+      </w:r>
+      <w:r>
+        <w:t xml:space="preserve"> </w:t>
+      </w:r>
+      <w:r>
+        <w:t xml:space="preserve">(stdlib</w:t>
+      </w:r>
+      <w:r>
+        <w:t xml:space="preserve"> </w:t>
+      </w:r>
+      <w:r>
+        <w:rPr>
+          <w:rStyle w:val="VerbatimChar"/>
+        </w:rPr>
+        <w:t xml:space="preserve">net</w:t>
+      </w:r>
+      <w:r>
+        <w:t xml:space="preserve"> </w:t>
+      </w:r>
+      <w:r>
+        <w:t xml:space="preserve">+</w:t>
+      </w:r>
+      <w:r>
+        <w:t xml:space="preserve"> </w:t>
+      </w:r>
+      <w:r>
+        <w:rPr>
+          <w:rStyle w:val="VerbatimChar"/>
+        </w:rPr>
+        <w:t xml:space="preserve">x/net/dnsmessage</w:t>
+      </w:r>
+      <w:r>
+        <w:t xml:space="preserve">): TXT encode/decode + reject-invalid + in-process loopback discovery; real-multicast two-node LAN capture sandbox-skipped (follow-up HXC-925); discovery-only (trust via SPIFFE) (HXC-1347).</w:t>
+      </w:r>
+    </w:p>
+    <w:p>
+      <w:pPr>
+        <w:pStyle w:val="Compact"/>
+        <w:numPr>
+          <w:ilvl w:val="2"/>
+          <w:numId w:val="1010"/>
+        </w:numPr>
+      </w:pPr>
+      <w:r>
+        <w:t xml:space="preserve">Reconciled stale P0</w:t>
+      </w:r>
+      <w:r>
+        <w:t xml:space="preserve"> </w:t>
+      </w:r>
+      <w:r>
+        <w:rPr>
+          <w:rStyle w:val="VerbatimChar"/>
+        </w:rPr>
+        <w:t xml:space="preserve">HXC-904</w:t>
+      </w:r>
+      <w:r>
+        <w:t xml:space="preserve"> </w:t>
+      </w:r>
+      <w:r>
+        <w:t xml:space="preserve">Phase-4 Build Service: delivered podman-based multi-arch container build orchestration + artifact cache (</w:t>
+      </w:r>
+      <w:r>
+        <w:rPr>
+          <w:rStyle w:val="VerbatimChar"/>
+        </w:rPr>
+        <w:t xml:space="preserve">internal/build</w:t>
+      </w:r>
+      <w:r>
+        <w:t xml:space="preserve">/</w:t>
+      </w:r>
+      <w:r>
+        <w:rPr>
+          <w:rStyle w:val="VerbatimChar"/>
+        </w:rPr>
+        <w:t xml:space="preserve">pkg/build</w:t>
+      </w:r>
+      <w:r>
+        <w:t xml:space="preserve">/</w:t>
+      </w:r>
+      <w:r>
+        <w:rPr>
+          <w:rStyle w:val="VerbatimChar"/>
+        </w:rPr>
+        <w:t xml:space="preserve">cmd/helix-build</w:t>
+      </w:r>
+      <w:r>
+        <w:t xml:space="preserve">, green) marked Completed; Bazel REAPI interop split to follow-up HXC-921.</w:t>
+      </w:r>
+    </w:p>
+    <w:p>
+      <w:pPr>
+        <w:pStyle w:val="Compact"/>
+        <w:numPr>
           <w:ilvl w:val="0"/>
           <w:numId w:val="1001"/>
         </w:numPr>
@@ -3998,7 +4322,7 @@
         <w:pStyle w:val="Compact"/>
         <w:numPr>
           <w:ilvl w:val="0"/>
-          <w:numId w:val="1010"/>
+          <w:numId w:val="1011"/>
         </w:numPr>
       </w:pPr>
       <w:r>
@@ -4055,7 +4379,7 @@
         <w:pStyle w:val="Compact"/>
         <w:numPr>
           <w:ilvl w:val="0"/>
-          <w:numId w:val="1011"/>
+          <w:numId w:val="1012"/>
         </w:numPr>
       </w:pPr>
       <w:r>
@@ -4312,6 +4636,9 @@
     <w:abstractNumId w:val="991"/>
   </w:num>
   <w:num w:numId="1011">
+    <w:abstractNumId w:val="991"/>
+  </w:num>
+  <w:num w:numId="1012">
     <w:abstractNumId w:val="991"/>
   </w:num>
 </w:numbering>

</xml_diff>

<commit_message>
docs: CLAUDE-3 sync for wave 93 — CHANGELOG (HXC-1636 deps-update) + PRR item 80 PASS (66/80, 82.5%); regenerate exports; docs_chain in-sync
Co-Authored-By: Claude Opus 4.8 <noreply@anthropic.com>
</commit_message>
<xml_diff>
--- a/docs/export/CHANGELOG.docx
+++ b/docs/export/CHANGELOG.docx
@@ -85,6 +85,97 @@
       </w:pPr>
       <w:r>
         <w:t xml:space="preserve">Added</w:t>
+      </w:r>
+    </w:p>
+    <w:p>
+      <w:pPr>
+        <w:pStyle w:val="Compact"/>
+        <w:numPr>
+          <w:ilvl w:val="0"/>
+          <w:numId w:val="1001"/>
+        </w:numPr>
+      </w:pPr>
+      <w:r>
+        <w:rPr>
+          <w:b/>
+          <w:bCs/>
+        </w:rPr>
+        <w:t xml:space="preserve">Wave 93 — local dependency-update maintenance (HXC-1636):</w:t>
+      </w:r>
+      <w:r>
+        <w:t xml:space="preserve"> </w:t>
+      </w:r>
+      <w:r>
+        <w:rPr>
+          <w:rStyle w:val="VerbatimChar"/>
+        </w:rPr>
+        <w:t xml:space="preserve">make deps-update</w:t>
+      </w:r>
+      <w:r>
+        <w:t xml:space="preserve"> </w:t>
+      </w:r>
+      <w:r>
+        <w:t xml:space="preserve">(scripts/deps-update.sh) runs per-module</w:t>
+      </w:r>
+      <w:r>
+        <w:t xml:space="preserve"> </w:t>
+      </w:r>
+      <w:r>
+        <w:rPr>
+          <w:rStyle w:val="VerbatimChar"/>
+        </w:rPr>
+        <w:t xml:space="preserve">go get -u</w:t>
+      </w:r>
+      <w:r>
+        <w:t xml:space="preserve"> </w:t>
+      </w:r>
+      <w:r>
+        <w:t xml:space="preserve">+</w:t>
+      </w:r>
+      <w:r>
+        <w:t xml:space="preserve"> </w:t>
+      </w:r>
+      <w:r>
+        <w:rPr>
+          <w:rStyle w:val="VerbatimChar"/>
+        </w:rPr>
+        <w:t xml:space="preserve">go work sync</w:t>
+      </w:r>
+      <w:r>
+        <w:t xml:space="preserve"> </w:t>
+      </w:r>
+      <w:r>
+        <w:t xml:space="preserve">+</w:t>
+      </w:r>
+      <w:r>
+        <w:t xml:space="preserve"> </w:t>
+      </w:r>
+      <w:r>
+        <w:rPr>
+          <w:rStyle w:val="VerbatimChar"/>
+        </w:rPr>
+        <w:t xml:space="preserve">govulncheck</w:t>
+      </w:r>
+      <w:r>
+        <w:t xml:space="preserve"> </w:t>
+      </w:r>
+      <w:r>
+        <w:t xml:space="preserve">+</w:t>
+      </w:r>
+      <w:r>
+        <w:t xml:space="preserve"> </w:t>
+      </w:r>
+      <w:r>
+        <w:rPr>
+          <w:rStyle w:val="VerbatimChar"/>
+        </w:rPr>
+        <w:t xml:space="preserve">make sbom</w:t>
+      </w:r>
+      <w:r>
+        <w:t xml:space="preserve"> </w:t>
+      </w:r>
+      <w:r>
+        <w:t xml:space="preserve">— the no-CI local equivalent of dependabot (operator-chosen). Closes PRR item 80; PRR now 66/80 (82.5%).</w:t>
       </w:r>
     </w:p>
     <w:p>

</xml_diff>